<commit_message>
Updated test plan with first two peer tests
</commit_message>
<xml_diff>
--- a/module-5/TestPlanTemplate.docx
+++ b/module-5/TestPlanTemplate.docx
@@ -413,21 +413,18 @@
       <w:sdtContent>
         <w:p>
           <w:pPr>
-            <w:pBdr>
-              <w:top w:val="nil"/>
-              <w:left w:val="nil"/>
-              <w:bottom w:val="nil"/>
-              <w:right w:val="nil"/>
-              <w:between w:val="nil"/>
-            </w:pBdr>
+            <w:pStyle w:val="TOC1"/>
             <w:tabs>
               <w:tab w:val="right" w:leader="dot" w:pos="12950"/>
             </w:tabs>
-            <w:spacing w:after="100"/>
             <w:rPr>
-              <w:color w:val="000000"/>
+              <w:rFonts w:asciiTheme="minorHAnsi" w:eastAsiaTheme="minorEastAsia" w:hAnsiTheme="minorHAnsi" w:cstheme="minorBidi"/>
+              <w:noProof/>
+              <w:kern w:val="2"/>
               <w:sz w:val="24"/>
               <w:szCs w:val="24"/>
+              <w:lang w:val="en-US" w:eastAsia="ja-JP"/>
+              <w14:ligatures w14:val="standardContextual"/>
             </w:rPr>
           </w:pPr>
           <w:r>
@@ -439,224 +436,449 @@
           <w:r>
             <w:fldChar w:fldCharType="separate"/>
           </w:r>
-          <w:hyperlink w:anchor="_heading=h.7o0ssvywmsda">
-            <w:r>
-              <w:rPr>
-                <w:rFonts w:ascii="Arial" w:eastAsia="Arial" w:hAnsi="Arial" w:cs="Arial"/>
-                <w:b/>
-                <w:bCs/>
-                <w:color w:val="000000"/>
-              </w:rPr>
-              <w:t>&lt;DESCRIPTION&gt;</w:t>
-            </w:r>
-          </w:hyperlink>
-          <w:hyperlink w:anchor="_heading=h.7o0ssvywmsda">
-            <w:r>
-              <w:rPr>
-                <w:color w:val="000000"/>
+          <w:hyperlink w:anchor="_Toc242638364" w:history="1">
+            <w:r>
+              <w:rPr>
+                <w:rStyle w:val="Hyperlink"/>
+                <w:rFonts w:ascii="Arial" w:eastAsia="Arial" w:hAnsi="Arial" w:cs="Arial"/>
+                <w:b/>
+                <w:bCs/>
+                <w:noProof/>
+              </w:rPr>
+              <w:t>Register normally</w:t>
+            </w:r>
+            <w:r>
+              <w:rPr>
+                <w:noProof/>
+                <w:webHidden/>
               </w:rPr>
               <w:tab/>
+            </w:r>
+            <w:r>
+              <w:rPr>
+                <w:noProof/>
+                <w:webHidden/>
+              </w:rPr>
+              <w:fldChar w:fldCharType="begin"/>
+            </w:r>
+            <w:r>
+              <w:rPr>
+                <w:noProof/>
+                <w:webHidden/>
+              </w:rPr>
+              <w:instrText xml:space="preserve"> PAGEREF _Toc242638364 \h </w:instrText>
+            </w:r>
+            <w:r>
+              <w:rPr>
+                <w:noProof/>
+                <w:webHidden/>
+              </w:rPr>
+            </w:r>
+            <w:r>
+              <w:rPr>
+                <w:noProof/>
+                <w:webHidden/>
+              </w:rPr>
+              <w:fldChar w:fldCharType="separate"/>
+            </w:r>
+            <w:r>
+              <w:rPr>
+                <w:noProof/>
+                <w:webHidden/>
+              </w:rPr>
               <w:t>2</w:t>
+            </w:r>
+            <w:r>
+              <w:rPr>
+                <w:noProof/>
+                <w:webHidden/>
+              </w:rPr>
+              <w:fldChar w:fldCharType="end"/>
             </w:r>
           </w:hyperlink>
         </w:p>
         <w:p>
           <w:pPr>
-            <w:pBdr>
-              <w:top w:val="nil"/>
-              <w:left w:val="nil"/>
-              <w:bottom w:val="nil"/>
-              <w:right w:val="nil"/>
-              <w:between w:val="nil"/>
-            </w:pBdr>
+            <w:pStyle w:val="TOC1"/>
             <w:tabs>
               <w:tab w:val="right" w:leader="dot" w:pos="12950"/>
             </w:tabs>
-            <w:spacing w:after="100"/>
             <w:rPr>
-              <w:color w:val="000000"/>
+              <w:rFonts w:asciiTheme="minorHAnsi" w:eastAsiaTheme="minorEastAsia" w:hAnsiTheme="minorHAnsi" w:cstheme="minorBidi"/>
+              <w:noProof/>
+              <w:kern w:val="2"/>
               <w:sz w:val="24"/>
               <w:szCs w:val="24"/>
+              <w:lang w:val="en-US" w:eastAsia="ja-JP"/>
+              <w14:ligatures w14:val="standardContextual"/>
             </w:rPr>
           </w:pPr>
-          <w:hyperlink w:anchor="_heading=h.f0y3alknvo7i">
-            <w:r>
-              <w:rPr>
-                <w:rFonts w:ascii="Arial" w:eastAsia="Arial" w:hAnsi="Arial" w:cs="Arial"/>
-                <w:b/>
-                <w:bCs/>
-                <w:color w:val="000000"/>
-              </w:rPr>
-              <w:t>&lt;DESCRIPTION&gt;</w:t>
-            </w:r>
-          </w:hyperlink>
-          <w:hyperlink w:anchor="_heading=h.f0y3alknvo7i">
-            <w:r>
-              <w:rPr>
-                <w:color w:val="000000"/>
+          <w:hyperlink w:anchor="_Toc242638365" w:history="1">
+            <w:r>
+              <w:rPr>
+                <w:rStyle w:val="Hyperlink"/>
+                <w:rFonts w:ascii="Arial" w:eastAsia="Arial" w:hAnsi="Arial" w:cs="Arial"/>
+                <w:b/>
+                <w:bCs/>
+                <w:noProof/>
+              </w:rPr>
+              <w:t>Register with errors</w:t>
+            </w:r>
+            <w:r>
+              <w:rPr>
+                <w:noProof/>
+                <w:webHidden/>
               </w:rPr>
               <w:tab/>
+            </w:r>
+            <w:r>
+              <w:rPr>
+                <w:noProof/>
+                <w:webHidden/>
+              </w:rPr>
+              <w:fldChar w:fldCharType="begin"/>
+            </w:r>
+            <w:r>
+              <w:rPr>
+                <w:noProof/>
+                <w:webHidden/>
+              </w:rPr>
+              <w:instrText xml:space="preserve"> PAGEREF _Toc242638365 \h </w:instrText>
+            </w:r>
+            <w:r>
+              <w:rPr>
+                <w:noProof/>
+                <w:webHidden/>
+              </w:rPr>
+            </w:r>
+            <w:r>
+              <w:rPr>
+                <w:noProof/>
+                <w:webHidden/>
+              </w:rPr>
+              <w:fldChar w:fldCharType="separate"/>
+            </w:r>
+            <w:r>
+              <w:rPr>
+                <w:noProof/>
+                <w:webHidden/>
+              </w:rPr>
               <w:t>2</w:t>
+            </w:r>
+            <w:r>
+              <w:rPr>
+                <w:noProof/>
+                <w:webHidden/>
+              </w:rPr>
+              <w:fldChar w:fldCharType="end"/>
             </w:r>
           </w:hyperlink>
         </w:p>
         <w:p>
           <w:pPr>
-            <w:pBdr>
-              <w:top w:val="nil"/>
-              <w:left w:val="nil"/>
-              <w:bottom w:val="nil"/>
-              <w:right w:val="nil"/>
-              <w:between w:val="nil"/>
-            </w:pBdr>
+            <w:pStyle w:val="TOC1"/>
             <w:tabs>
               <w:tab w:val="right" w:leader="dot" w:pos="12950"/>
             </w:tabs>
-            <w:spacing w:after="100"/>
             <w:rPr>
-              <w:color w:val="000000"/>
+              <w:rFonts w:asciiTheme="minorHAnsi" w:eastAsiaTheme="minorEastAsia" w:hAnsiTheme="minorHAnsi" w:cstheme="minorBidi"/>
+              <w:noProof/>
+              <w:kern w:val="2"/>
               <w:sz w:val="24"/>
               <w:szCs w:val="24"/>
+              <w:lang w:val="en-US" w:eastAsia="ja-JP"/>
+              <w14:ligatures w14:val="standardContextual"/>
             </w:rPr>
           </w:pPr>
-          <w:hyperlink w:anchor="_heading=h.wu6bohrjeevp">
-            <w:r>
-              <w:rPr>
-                <w:rFonts w:ascii="Arial" w:eastAsia="Arial" w:hAnsi="Arial" w:cs="Arial"/>
-                <w:b/>
-                <w:bCs/>
-                <w:color w:val="000000"/>
-              </w:rPr>
-              <w:t>&lt;DESCRIPTION&gt;</w:t>
-            </w:r>
-          </w:hyperlink>
-          <w:hyperlink w:anchor="_heading=h.wu6bohrjeevp">
-            <w:r>
-              <w:rPr>
-                <w:color w:val="000000"/>
+          <w:hyperlink w:anchor="_Toc242638366" w:history="1">
+            <w:r>
+              <w:rPr>
+                <w:rStyle w:val="Hyperlink"/>
+                <w:rFonts w:ascii="Arial" w:eastAsia="Arial" w:hAnsi="Arial" w:cs="Arial"/>
+                <w:b/>
+                <w:bCs/>
+                <w:noProof/>
+              </w:rPr>
+              <w:t>OPEN THE HOME PAGE</w:t>
+            </w:r>
+            <w:r>
+              <w:rPr>
+                <w:noProof/>
+                <w:webHidden/>
               </w:rPr>
               <w:tab/>
+            </w:r>
+            <w:r>
+              <w:rPr>
+                <w:noProof/>
+                <w:webHidden/>
+              </w:rPr>
+              <w:fldChar w:fldCharType="begin"/>
+            </w:r>
+            <w:r>
+              <w:rPr>
+                <w:noProof/>
+                <w:webHidden/>
+              </w:rPr>
+              <w:instrText xml:space="preserve"> PAGEREF _Toc242638366 \h </w:instrText>
+            </w:r>
+            <w:r>
+              <w:rPr>
+                <w:noProof/>
+                <w:webHidden/>
+              </w:rPr>
+            </w:r>
+            <w:r>
+              <w:rPr>
+                <w:noProof/>
+                <w:webHidden/>
+              </w:rPr>
+              <w:fldChar w:fldCharType="separate"/>
+            </w:r>
+            <w:r>
+              <w:rPr>
+                <w:noProof/>
+                <w:webHidden/>
+              </w:rPr>
               <w:t>3</w:t>
+            </w:r>
+            <w:r>
+              <w:rPr>
+                <w:noProof/>
+                <w:webHidden/>
+              </w:rPr>
+              <w:fldChar w:fldCharType="end"/>
             </w:r>
           </w:hyperlink>
         </w:p>
         <w:p>
           <w:pPr>
-            <w:pBdr>
-              <w:top w:val="nil"/>
-              <w:left w:val="nil"/>
-              <w:bottom w:val="nil"/>
-              <w:right w:val="nil"/>
-              <w:between w:val="nil"/>
-            </w:pBdr>
+            <w:pStyle w:val="TOC1"/>
             <w:tabs>
               <w:tab w:val="right" w:leader="dot" w:pos="12950"/>
             </w:tabs>
-            <w:spacing w:after="100"/>
             <w:rPr>
-              <w:color w:val="000000"/>
+              <w:rFonts w:asciiTheme="minorHAnsi" w:eastAsiaTheme="minorEastAsia" w:hAnsiTheme="minorHAnsi" w:cstheme="minorBidi"/>
+              <w:noProof/>
+              <w:kern w:val="2"/>
               <w:sz w:val="24"/>
               <w:szCs w:val="24"/>
+              <w:lang w:val="en-US" w:eastAsia="ja-JP"/>
+              <w14:ligatures w14:val="standardContextual"/>
             </w:rPr>
           </w:pPr>
-          <w:hyperlink w:anchor="_heading=h.9fg04o7hh3bc">
-            <w:r>
-              <w:rPr>
-                <w:rFonts w:ascii="Arial" w:eastAsia="Arial" w:hAnsi="Arial" w:cs="Arial"/>
-                <w:b/>
-                <w:bCs/>
-                <w:color w:val="000000"/>
-              </w:rPr>
-              <w:t>&lt;DESCRIPTION&gt;</w:t>
-            </w:r>
-          </w:hyperlink>
-          <w:hyperlink w:anchor="_heading=h.9fg04o7hh3bc">
-            <w:r>
-              <w:rPr>
-                <w:color w:val="000000"/>
+          <w:hyperlink w:anchor="_Toc242638367" w:history="1">
+            <w:r>
+              <w:rPr>
+                <w:rStyle w:val="Hyperlink"/>
+                <w:rFonts w:ascii="Arial" w:eastAsia="Arial" w:hAnsi="Arial" w:cs="Arial"/>
+                <w:b/>
+                <w:bCs/>
+                <w:noProof/>
+              </w:rPr>
+              <w:t>HOME, LOGIN, REGISTER NAVIGATION</w:t>
+            </w:r>
+            <w:r>
+              <w:rPr>
+                <w:noProof/>
+                <w:webHidden/>
               </w:rPr>
               <w:tab/>
-              <w:t>3</w:t>
+            </w:r>
+            <w:r>
+              <w:rPr>
+                <w:noProof/>
+                <w:webHidden/>
+              </w:rPr>
+              <w:fldChar w:fldCharType="begin"/>
+            </w:r>
+            <w:r>
+              <w:rPr>
+                <w:noProof/>
+                <w:webHidden/>
+              </w:rPr>
+              <w:instrText xml:space="preserve"> PAGEREF _Toc242638367 \h </w:instrText>
+            </w:r>
+            <w:r>
+              <w:rPr>
+                <w:noProof/>
+                <w:webHidden/>
+              </w:rPr>
+            </w:r>
+            <w:r>
+              <w:rPr>
+                <w:noProof/>
+                <w:webHidden/>
+              </w:rPr>
+              <w:fldChar w:fldCharType="separate"/>
+            </w:r>
+            <w:r>
+              <w:rPr>
+                <w:noProof/>
+                <w:webHidden/>
+              </w:rPr>
+              <w:t>4</w:t>
+            </w:r>
+            <w:r>
+              <w:rPr>
+                <w:noProof/>
+                <w:webHidden/>
+              </w:rPr>
+              <w:fldChar w:fldCharType="end"/>
             </w:r>
           </w:hyperlink>
         </w:p>
         <w:p>
           <w:pPr>
-            <w:pBdr>
-              <w:top w:val="nil"/>
-              <w:left w:val="nil"/>
-              <w:bottom w:val="nil"/>
-              <w:right w:val="nil"/>
-              <w:between w:val="nil"/>
-            </w:pBdr>
+            <w:pStyle w:val="TOC1"/>
             <w:tabs>
               <w:tab w:val="right" w:leader="dot" w:pos="12950"/>
             </w:tabs>
-            <w:spacing w:after="100"/>
             <w:rPr>
-              <w:color w:val="000000"/>
+              <w:rFonts w:asciiTheme="minorHAnsi" w:eastAsiaTheme="minorEastAsia" w:hAnsiTheme="minorHAnsi" w:cstheme="minorBidi"/>
+              <w:noProof/>
+              <w:kern w:val="2"/>
               <w:sz w:val="24"/>
               <w:szCs w:val="24"/>
+              <w:lang w:val="en-US" w:eastAsia="ja-JP"/>
+              <w14:ligatures w14:val="standardContextual"/>
             </w:rPr>
           </w:pPr>
-          <w:hyperlink w:anchor="_heading=h.gat4iv42bcug">
-            <w:r>
-              <w:rPr>
-                <w:rFonts w:ascii="Arial" w:eastAsia="Arial" w:hAnsi="Arial" w:cs="Arial"/>
-                <w:b/>
-                <w:bCs/>
-                <w:color w:val="000000"/>
-              </w:rPr>
-              <w:t>&lt;DESCRIPTION&gt;</w:t>
-            </w:r>
-          </w:hyperlink>
-          <w:hyperlink w:anchor="_heading=h.gat4iv42bcug">
-            <w:r>
-              <w:rPr>
-                <w:color w:val="000000"/>
+          <w:hyperlink w:anchor="_Toc242638368" w:history="1">
+            <w:r>
+              <w:rPr>
+                <w:rStyle w:val="Hyperlink"/>
+                <w:rFonts w:ascii="Arial" w:eastAsia="Arial" w:hAnsi="Arial" w:cs="Arial"/>
+                <w:b/>
+                <w:bCs/>
+                <w:noProof/>
+              </w:rPr>
+              <w:t>Login normally</w:t>
+            </w:r>
+            <w:r>
+              <w:rPr>
+                <w:noProof/>
+                <w:webHidden/>
               </w:rPr>
               <w:tab/>
-              <w:t>4</w:t>
+            </w:r>
+            <w:r>
+              <w:rPr>
+                <w:noProof/>
+                <w:webHidden/>
+              </w:rPr>
+              <w:fldChar w:fldCharType="begin"/>
+            </w:r>
+            <w:r>
+              <w:rPr>
+                <w:noProof/>
+                <w:webHidden/>
+              </w:rPr>
+              <w:instrText xml:space="preserve"> PAGEREF _Toc242638368 \h </w:instrText>
+            </w:r>
+            <w:r>
+              <w:rPr>
+                <w:noProof/>
+                <w:webHidden/>
+              </w:rPr>
+            </w:r>
+            <w:r>
+              <w:rPr>
+                <w:noProof/>
+                <w:webHidden/>
+              </w:rPr>
+              <w:fldChar w:fldCharType="separate"/>
+            </w:r>
+            <w:r>
+              <w:rPr>
+                <w:noProof/>
+                <w:webHidden/>
+              </w:rPr>
+              <w:t>6</w:t>
+            </w:r>
+            <w:r>
+              <w:rPr>
+                <w:noProof/>
+                <w:webHidden/>
+              </w:rPr>
+              <w:fldChar w:fldCharType="end"/>
             </w:r>
           </w:hyperlink>
         </w:p>
         <w:p>
           <w:pPr>
-            <w:pBdr>
-              <w:top w:val="nil"/>
-              <w:left w:val="nil"/>
-              <w:bottom w:val="nil"/>
-              <w:right w:val="nil"/>
-              <w:between w:val="nil"/>
-            </w:pBdr>
+            <w:pStyle w:val="TOC1"/>
             <w:tabs>
               <w:tab w:val="right" w:leader="dot" w:pos="12950"/>
             </w:tabs>
-            <w:spacing w:after="100"/>
             <w:rPr>
-              <w:color w:val="000000"/>
+              <w:rFonts w:asciiTheme="minorHAnsi" w:eastAsiaTheme="minorEastAsia" w:hAnsiTheme="minorHAnsi" w:cstheme="minorBidi"/>
+              <w:noProof/>
+              <w:kern w:val="2"/>
               <w:sz w:val="24"/>
               <w:szCs w:val="24"/>
+              <w:lang w:val="en-US" w:eastAsia="ja-JP"/>
+              <w14:ligatures w14:val="standardContextual"/>
             </w:rPr>
           </w:pPr>
-          <w:hyperlink w:anchor="_heading=h.tdkw0xvd0kd3">
-            <w:r>
-              <w:rPr>
-                <w:rFonts w:ascii="Arial" w:eastAsia="Arial" w:hAnsi="Arial" w:cs="Arial"/>
-                <w:b/>
-                <w:bCs/>
-                <w:color w:val="000000"/>
-              </w:rPr>
-              <w:t>&lt;DESCRIPTION&gt;</w:t>
-            </w:r>
-          </w:hyperlink>
-          <w:hyperlink w:anchor="_heading=h.tdkw0xvd0kd3">
-            <w:r>
-              <w:rPr>
-                <w:color w:val="000000"/>
+          <w:hyperlink w:anchor="_Toc242638369" w:history="1">
+            <w:r>
+              <w:rPr>
+                <w:rStyle w:val="Hyperlink"/>
+                <w:rFonts w:ascii="Arial" w:eastAsia="Arial" w:hAnsi="Arial" w:cs="Arial"/>
+                <w:b/>
+                <w:bCs/>
+                <w:noProof/>
+              </w:rPr>
+              <w:t>Login with errors</w:t>
+            </w:r>
+            <w:r>
+              <w:rPr>
+                <w:noProof/>
+                <w:webHidden/>
               </w:rPr>
               <w:tab/>
-              <w:t>4</w:t>
+            </w:r>
+            <w:r>
+              <w:rPr>
+                <w:noProof/>
+                <w:webHidden/>
+              </w:rPr>
+              <w:fldChar w:fldCharType="begin"/>
+            </w:r>
+            <w:r>
+              <w:rPr>
+                <w:noProof/>
+                <w:webHidden/>
+              </w:rPr>
+              <w:instrText xml:space="preserve"> PAGEREF _Toc242638369 \h </w:instrText>
+            </w:r>
+            <w:r>
+              <w:rPr>
+                <w:noProof/>
+                <w:webHidden/>
+              </w:rPr>
+            </w:r>
+            <w:r>
+              <w:rPr>
+                <w:noProof/>
+                <w:webHidden/>
+              </w:rPr>
+              <w:fldChar w:fldCharType="separate"/>
+            </w:r>
+            <w:r>
+              <w:rPr>
+                <w:noProof/>
+                <w:webHidden/>
+              </w:rPr>
+              <w:t>7</w:t>
+            </w:r>
+            <w:r>
+              <w:rPr>
+                <w:noProof/>
+                <w:webHidden/>
+              </w:rPr>
+              <w:fldChar w:fldCharType="end"/>
             </w:r>
           </w:hyperlink>
         </w:p>
@@ -1135,13 +1357,13 @@
           <w:p>
             <w:pPr>
               <w:pStyle w:val="Heading1"/>
-              <w:outlineLvl w:val="0"/>
-              <w:rPr>
-                <w:rFonts w:ascii="Arial" w:eastAsia="Arial" w:hAnsi="Arial" w:cs="Arial"/>
-                <w:b/>
-                <w:bCs/>
-              </w:rPr>
-            </w:pPr>
+              <w:rPr>
+                <w:rFonts w:ascii="Arial" w:eastAsia="Arial" w:hAnsi="Arial" w:cs="Arial"/>
+                <w:b/>
+                <w:bCs/>
+              </w:rPr>
+            </w:pPr>
+            <w:bookmarkStart w:id="0" w:name="_Toc242638364"/>
             <w:r>
               <w:rPr>
                 <w:rFonts w:ascii="Arial" w:eastAsia="Arial" w:hAnsi="Arial" w:cs="Arial"/>
@@ -1151,6 +1373,7 @@
               </w:rPr>
               <w:t>Register normally</w:t>
             </w:r>
+            <w:bookmarkEnd w:id="0"/>
           </w:p>
         </w:tc>
       </w:tr>
@@ -1206,7 +1429,6 @@
             <w:r>
               <w:rPr>
                 <w:rFonts w:ascii="Arial" w:eastAsia="Arial" w:hAnsi="Arial" w:cs="Arial"/>
-                <w:color w:val="C00000"/>
                 <w:sz w:val="20"/>
                 <w:szCs w:val="20"/>
               </w:rPr>
@@ -1263,16 +1485,7 @@
                 <w:sz w:val="20"/>
                 <w:szCs w:val="20"/>
               </w:rPr>
-              <w:t xml:space="preserve"> </w:t>
-            </w:r>
-            <w:r>
-              <w:rPr>
-                <w:rFonts w:ascii="Arial" w:eastAsia="Arial" w:hAnsi="Arial" w:cs="Arial"/>
-                <w:color w:val="C00000"/>
-                <w:sz w:val="20"/>
-                <w:szCs w:val="20"/>
-              </w:rPr>
-              <w:t xml:space="preserve">2026/10/08 </w:t>
+              <w:t xml:space="preserve"> 2026/10/08 </w:t>
             </w:r>
           </w:p>
         </w:tc>
@@ -2289,13 +2502,13 @@
           <w:p>
             <w:pPr>
               <w:pStyle w:val="Heading1"/>
-              <w:outlineLvl w:val="0"/>
-              <w:rPr>
-                <w:rFonts w:ascii="Arial" w:eastAsia="Arial" w:hAnsi="Arial" w:cs="Arial"/>
-                <w:b/>
-                <w:bCs/>
-              </w:rPr>
-            </w:pPr>
+              <w:rPr>
+                <w:rFonts w:ascii="Arial" w:eastAsia="Arial" w:hAnsi="Arial" w:cs="Arial"/>
+                <w:b/>
+                <w:bCs/>
+              </w:rPr>
+            </w:pPr>
+            <w:bookmarkStart w:id="1" w:name="_Toc242638365"/>
             <w:r>
               <w:rPr>
                 <w:rFonts w:ascii="Arial" w:eastAsia="Arial" w:hAnsi="Arial" w:cs="Arial"/>
@@ -2305,6 +2518,7 @@
               </w:rPr>
               <w:t>Register with errors</w:t>
             </w:r>
+            <w:bookmarkEnd w:id="1"/>
           </w:p>
         </w:tc>
       </w:tr>
@@ -3751,15 +3965,13 @@
           <w:p>
             <w:pPr>
               <w:pStyle w:val="Heading1"/>
-              <w:outlineLvl w:val="0"/>
-              <w:rPr>
-                <w:rFonts w:ascii="Arial" w:eastAsia="Arial" w:hAnsi="Arial" w:cs="Arial"/>
-                <w:b/>
-                <w:bCs/>
-              </w:rPr>
-            </w:pPr>
-            <w:bookmarkStart w:id="0" w:name="_heading=h.wu6bohrjeevp" w:colFirst="0" w:colLast="0"/>
-            <w:bookmarkEnd w:id="0"/>
+              <w:rPr>
+                <w:rFonts w:ascii="Arial" w:eastAsia="Arial" w:hAnsi="Arial" w:cs="Arial"/>
+                <w:b/>
+                <w:bCs/>
+              </w:rPr>
+            </w:pPr>
+            <w:bookmarkStart w:id="2" w:name="_Toc242638366"/>
             <w:r>
               <w:rPr>
                 <w:rFonts w:ascii="Arial" w:eastAsia="Arial" w:hAnsi="Arial" w:cs="Arial"/>
@@ -3769,6 +3981,7 @@
               </w:rPr>
               <w:t>OPEN THE HOME PAGE</w:t>
             </w:r>
+            <w:bookmarkEnd w:id="2"/>
           </w:p>
         </w:tc>
       </w:tr>
@@ -3901,6 +4114,16 @@
               </w:rPr>
               <w:t xml:space="preserve">Peer tester: </w:t>
             </w:r>
+            <w:r>
+              <w:rPr>
+                <w:rFonts w:ascii="Arial" w:eastAsia="Arial" w:hAnsi="Arial" w:cs="Arial"/>
+                <w:b/>
+                <w:bCs/>
+                <w:sz w:val="20"/>
+                <w:szCs w:val="20"/>
+              </w:rPr>
+              <w:t>Daniel Preller</w:t>
+            </w:r>
           </w:p>
           <w:p>
             <w:pPr>
@@ -3935,27 +4158,7 @@
                 <w:sz w:val="20"/>
                 <w:szCs w:val="20"/>
               </w:rPr>
-              <w:t>&lt;</w:t>
-            </w:r>
-            <w:proofErr w:type="spellStart"/>
-            <w:r>
-              <w:rPr>
-                <w:rFonts w:ascii="Arial" w:eastAsia="Arial" w:hAnsi="Arial" w:cs="Arial"/>
-                <w:color w:val="C00000"/>
-                <w:sz w:val="20"/>
-                <w:szCs w:val="20"/>
-              </w:rPr>
-              <w:t>yyyy</w:t>
-            </w:r>
-            <w:proofErr w:type="spellEnd"/>
-            <w:r>
-              <w:rPr>
-                <w:rFonts w:ascii="Arial" w:eastAsia="Arial" w:hAnsi="Arial" w:cs="Arial"/>
-                <w:color w:val="C00000"/>
-                <w:sz w:val="20"/>
-                <w:szCs w:val="20"/>
-              </w:rPr>
-              <w:t>/mm/dd&gt;</w:t>
+              <w:t>2023/10/11</w:t>
             </w:r>
           </w:p>
         </w:tc>
@@ -4206,19 +4409,17 @@
               <w:spacing w:before="80" w:after="80"/>
               <w:rPr>
                 <w:rFonts w:ascii="Arial" w:eastAsia="Arial" w:hAnsi="Arial" w:cs="Arial"/>
-                <w:color w:val="C00000"/>
-                <w:sz w:val="20"/>
-                <w:szCs w:val="20"/>
-              </w:rPr>
-            </w:pPr>
-            <w:r>
-              <w:rPr>
-                <w:rFonts w:ascii="Arial" w:eastAsia="Arial" w:hAnsi="Arial" w:cs="Arial"/>
-                <w:color w:val="C00000"/>
-                <w:sz w:val="20"/>
-                <w:szCs w:val="20"/>
-              </w:rPr>
-              <w:t>&lt;yes/no&gt;</w:t>
+                <w:sz w:val="20"/>
+                <w:szCs w:val="20"/>
+              </w:rPr>
+            </w:pPr>
+            <w:r>
+              <w:rPr>
+                <w:rFonts w:ascii="Arial" w:eastAsia="Arial" w:hAnsi="Arial" w:cs="Arial"/>
+                <w:sz w:val="20"/>
+                <w:szCs w:val="20"/>
+              </w:rPr>
+              <w:t>yes</w:t>
             </w:r>
           </w:p>
         </w:tc>
@@ -4382,19 +4583,17 @@
               <w:spacing w:before="80" w:after="80"/>
               <w:rPr>
                 <w:rFonts w:ascii="Arial" w:eastAsia="Arial" w:hAnsi="Arial" w:cs="Arial"/>
-                <w:color w:val="C00000"/>
-                <w:sz w:val="20"/>
-                <w:szCs w:val="20"/>
-              </w:rPr>
-            </w:pPr>
-            <w:r>
-              <w:rPr>
-                <w:rFonts w:ascii="Arial" w:eastAsia="Arial" w:hAnsi="Arial" w:cs="Arial"/>
-                <w:color w:val="C00000"/>
-                <w:sz w:val="20"/>
-                <w:szCs w:val="20"/>
-              </w:rPr>
-              <w:t>&lt;yes/no&gt;</w:t>
+                <w:sz w:val="20"/>
+                <w:szCs w:val="20"/>
+              </w:rPr>
+            </w:pPr>
+            <w:r>
+              <w:rPr>
+                <w:rFonts w:ascii="Arial" w:eastAsia="Arial" w:hAnsi="Arial" w:cs="Arial"/>
+                <w:sz w:val="20"/>
+                <w:szCs w:val="20"/>
+              </w:rPr>
+              <w:t>yes</w:t>
             </w:r>
           </w:p>
         </w:tc>
@@ -4504,19 +4703,76 @@
               <w:spacing w:before="80" w:after="80"/>
               <w:rPr>
                 <w:rFonts w:ascii="Arial" w:eastAsia="Arial" w:hAnsi="Arial" w:cs="Arial"/>
-                <w:color w:val="C00000"/>
-                <w:sz w:val="20"/>
-                <w:szCs w:val="20"/>
-              </w:rPr>
-            </w:pPr>
-            <w:r>
-              <w:rPr>
-                <w:rFonts w:ascii="Arial" w:eastAsia="Arial" w:hAnsi="Arial" w:cs="Arial"/>
-                <w:color w:val="C00000"/>
-                <w:sz w:val="20"/>
-                <w:szCs w:val="20"/>
-              </w:rPr>
-              <w:t>&lt;yes/no&gt;</w:t>
+                <w:sz w:val="20"/>
+                <w:szCs w:val="20"/>
+              </w:rPr>
+            </w:pPr>
+            <w:r>
+              <w:rPr>
+                <w:rFonts w:ascii="Arial" w:eastAsia="Arial" w:hAnsi="Arial" w:cs="Arial"/>
+                <w:sz w:val="20"/>
+                <w:szCs w:val="20"/>
+              </w:rPr>
+              <w:t>yes</w:t>
+            </w:r>
+          </w:p>
+          <w:p>
+            <w:pPr>
+              <w:spacing w:before="80" w:after="80"/>
+              <w:rPr>
+                <w:rFonts w:ascii="Arial" w:eastAsia="Arial" w:hAnsi="Arial" w:cs="Arial"/>
+                <w:sz w:val="20"/>
+                <w:szCs w:val="20"/>
+              </w:rPr>
+            </w:pPr>
+            <w:r>
+              <w:rPr>
+                <w:rFonts w:ascii="Arial" w:eastAsia="Arial" w:hAnsi="Arial" w:cs="Arial"/>
+                <w:noProof/>
+                <w:sz w:val="20"/>
+                <w:szCs w:val="20"/>
+              </w:rPr>
+              <w:drawing>
+                <wp:inline distT="0" distB="0" distL="0" distR="0" wp14:anchorId="011878CF" wp14:editId="1CE40ED3">
+                  <wp:extent cx="1165860" cy="633730"/>
+                  <wp:effectExtent l="0" t="0" r="0" b="0"/>
+                  <wp:docPr id="462113780" name="Picture 1"/>
+                  <wp:cNvGraphicFramePr>
+                    <a:graphicFrameLocks xmlns:a="http://schemas.openxmlformats.org/drawingml/2006/main" noChangeAspect="1"/>
+                  </wp:cNvGraphicFramePr>
+                  <a:graphic xmlns:a="http://schemas.openxmlformats.org/drawingml/2006/main">
+                    <a:graphicData uri="http://schemas.openxmlformats.org/drawingml/2006/picture">
+                      <pic:pic xmlns:pic="http://schemas.openxmlformats.org/drawingml/2006/picture">
+                        <pic:nvPicPr>
+                          <pic:cNvPr id="462113780" name="Picture 462113780"/>
+                          <pic:cNvPicPr/>
+                        </pic:nvPicPr>
+                        <pic:blipFill>
+                          <a:blip r:embed="rId7" cstate="print">
+                            <a:extLst>
+                              <a:ext uri="{28A0092B-C50C-407E-A947-70E740481C1C}">
+                                <a14:useLocalDpi xmlns:a14="http://schemas.microsoft.com/office/drawing/2010/main" val="0"/>
+                              </a:ext>
+                            </a:extLst>
+                          </a:blip>
+                          <a:stretch>
+                            <a:fillRect/>
+                          </a:stretch>
+                        </pic:blipFill>
+                        <pic:spPr>
+                          <a:xfrm>
+                            <a:off x="0" y="0"/>
+                            <a:ext cx="1165860" cy="633730"/>
+                          </a:xfrm>
+                          <a:prstGeom prst="rect">
+                            <a:avLst/>
+                          </a:prstGeom>
+                        </pic:spPr>
+                      </pic:pic>
+                    </a:graphicData>
+                  </a:graphic>
+                </wp:inline>
+              </w:drawing>
             </w:r>
           </w:p>
         </w:tc>
@@ -4626,19 +4882,17 @@
               <w:spacing w:before="80" w:after="80"/>
               <w:rPr>
                 <w:rFonts w:ascii="Arial" w:eastAsia="Arial" w:hAnsi="Arial" w:cs="Arial"/>
-                <w:color w:val="C00000"/>
-                <w:sz w:val="20"/>
-                <w:szCs w:val="20"/>
-              </w:rPr>
-            </w:pPr>
-            <w:r>
-              <w:rPr>
-                <w:rFonts w:ascii="Arial" w:eastAsia="Arial" w:hAnsi="Arial" w:cs="Arial"/>
-                <w:color w:val="C00000"/>
-                <w:sz w:val="20"/>
-                <w:szCs w:val="20"/>
-              </w:rPr>
-              <w:t>&lt;yes/no&gt;</w:t>
+                <w:sz w:val="20"/>
+                <w:szCs w:val="20"/>
+              </w:rPr>
+            </w:pPr>
+            <w:r>
+              <w:rPr>
+                <w:rFonts w:ascii="Arial" w:eastAsia="Arial" w:hAnsi="Arial" w:cs="Arial"/>
+                <w:sz w:val="20"/>
+                <w:szCs w:val="20"/>
+              </w:rPr>
+              <w:t>yes</w:t>
             </w:r>
           </w:p>
         </w:tc>
@@ -4748,19 +5002,17 @@
               <w:spacing w:before="80" w:after="80"/>
               <w:rPr>
                 <w:rFonts w:ascii="Arial" w:eastAsia="Arial" w:hAnsi="Arial" w:cs="Arial"/>
-                <w:color w:val="C00000"/>
-                <w:sz w:val="20"/>
-                <w:szCs w:val="20"/>
-              </w:rPr>
-            </w:pPr>
-            <w:r>
-              <w:rPr>
-                <w:rFonts w:ascii="Arial" w:eastAsia="Arial" w:hAnsi="Arial" w:cs="Arial"/>
-                <w:color w:val="C00000"/>
-                <w:sz w:val="20"/>
-                <w:szCs w:val="20"/>
-              </w:rPr>
-              <w:t>&lt;yes/no&gt;</w:t>
+                <w:sz w:val="20"/>
+                <w:szCs w:val="20"/>
+              </w:rPr>
+            </w:pPr>
+            <w:r>
+              <w:rPr>
+                <w:rFonts w:ascii="Arial" w:eastAsia="Arial" w:hAnsi="Arial" w:cs="Arial"/>
+                <w:sz w:val="20"/>
+                <w:szCs w:val="20"/>
+              </w:rPr>
+              <w:t>yes</w:t>
             </w:r>
           </w:p>
         </w:tc>
@@ -4870,11 +5122,18 @@
               <w:spacing w:before="80" w:after="80"/>
               <w:rPr>
                 <w:rFonts w:ascii="Arial" w:eastAsia="Arial" w:hAnsi="Arial" w:cs="Arial"/>
-                <w:color w:val="C00000"/>
-                <w:sz w:val="20"/>
-                <w:szCs w:val="20"/>
-              </w:rPr>
-            </w:pPr>
+                <w:sz w:val="20"/>
+                <w:szCs w:val="20"/>
+              </w:rPr>
+            </w:pPr>
+            <w:r>
+              <w:rPr>
+                <w:rFonts w:ascii="Arial" w:eastAsia="Arial" w:hAnsi="Arial" w:cs="Arial"/>
+                <w:sz w:val="20"/>
+                <w:szCs w:val="20"/>
+              </w:rPr>
+              <w:t>yes</w:t>
+            </w:r>
           </w:p>
         </w:tc>
       </w:tr>
@@ -4983,11 +5242,18 @@
               <w:spacing w:before="80" w:after="80"/>
               <w:rPr>
                 <w:rFonts w:ascii="Arial" w:eastAsia="Arial" w:hAnsi="Arial" w:cs="Arial"/>
-                <w:color w:val="C00000"/>
-                <w:sz w:val="20"/>
-                <w:szCs w:val="20"/>
-              </w:rPr>
-            </w:pPr>
+                <w:sz w:val="20"/>
+                <w:szCs w:val="20"/>
+              </w:rPr>
+            </w:pPr>
+            <w:r>
+              <w:rPr>
+                <w:rFonts w:ascii="Arial" w:eastAsia="Arial" w:hAnsi="Arial" w:cs="Arial"/>
+                <w:sz w:val="20"/>
+                <w:szCs w:val="20"/>
+              </w:rPr>
+              <w:t>no (captions are not present)</w:t>
+            </w:r>
           </w:p>
         </w:tc>
       </w:tr>
@@ -5096,11 +5362,18 @@
               <w:spacing w:before="80" w:after="80"/>
               <w:rPr>
                 <w:rFonts w:ascii="Arial" w:eastAsia="Arial" w:hAnsi="Arial" w:cs="Arial"/>
-                <w:color w:val="C00000"/>
-                <w:sz w:val="20"/>
-                <w:szCs w:val="20"/>
-              </w:rPr>
-            </w:pPr>
+                <w:sz w:val="20"/>
+                <w:szCs w:val="20"/>
+              </w:rPr>
+            </w:pPr>
+            <w:r>
+              <w:rPr>
+                <w:rFonts w:ascii="Arial" w:eastAsia="Arial" w:hAnsi="Arial" w:cs="Arial"/>
+                <w:sz w:val="20"/>
+                <w:szCs w:val="20"/>
+              </w:rPr>
+              <w:t>yes</w:t>
+            </w:r>
           </w:p>
         </w:tc>
       </w:tr>
@@ -5145,19 +5418,17 @@
               <w:spacing w:before="80" w:after="80"/>
               <w:rPr>
                 <w:rFonts w:ascii="Arial" w:eastAsia="Arial" w:hAnsi="Arial" w:cs="Arial"/>
-                <w:color w:val="C00000"/>
-                <w:sz w:val="20"/>
-                <w:szCs w:val="20"/>
-              </w:rPr>
-            </w:pPr>
-            <w:r>
-              <w:rPr>
-                <w:rFonts w:ascii="Arial" w:eastAsia="Arial" w:hAnsi="Arial" w:cs="Arial"/>
-                <w:color w:val="C00000"/>
-                <w:sz w:val="20"/>
-                <w:szCs w:val="20"/>
-              </w:rPr>
-              <w:t>Comments should be substantive; this means there should be at least 2-3 well-structured sentences with constructive feedback.</w:t>
+                <w:sz w:val="20"/>
+                <w:szCs w:val="20"/>
+              </w:rPr>
+            </w:pPr>
+            <w:r>
+              <w:rPr>
+                <w:rFonts w:ascii="Arial" w:eastAsia="Arial" w:hAnsi="Arial" w:cs="Arial"/>
+                <w:sz w:val="20"/>
+                <w:szCs w:val="20"/>
+              </w:rPr>
+              <w:t>The current home page is well designed. Captions need to be added. The navigation links could benefit from an indication when they are being hovered over.</w:t>
             </w:r>
           </w:p>
         </w:tc>
@@ -5247,15 +5518,13 @@
           <w:p>
             <w:pPr>
               <w:pStyle w:val="Heading1"/>
-              <w:outlineLvl w:val="0"/>
-              <w:rPr>
-                <w:rFonts w:ascii="Arial" w:eastAsia="Arial" w:hAnsi="Arial" w:cs="Arial"/>
-                <w:b/>
-                <w:bCs/>
-              </w:rPr>
-            </w:pPr>
-            <w:bookmarkStart w:id="1" w:name="_heading=h.9fg04o7hh3bc" w:colFirst="0" w:colLast="0"/>
-            <w:bookmarkEnd w:id="1"/>
+              <w:rPr>
+                <w:rFonts w:ascii="Arial" w:eastAsia="Arial" w:hAnsi="Arial" w:cs="Arial"/>
+                <w:b/>
+                <w:bCs/>
+              </w:rPr>
+            </w:pPr>
+            <w:bookmarkStart w:id="3" w:name="_Toc242638367"/>
             <w:r>
               <w:rPr>
                 <w:rFonts w:ascii="Arial" w:eastAsia="Arial" w:hAnsi="Arial" w:cs="Arial"/>
@@ -5265,6 +5534,7 @@
               </w:rPr>
               <w:t>HOME, LOGIN, REGISTER NAVIGATION</w:t>
             </w:r>
+            <w:bookmarkEnd w:id="3"/>
           </w:p>
         </w:tc>
       </w:tr>
@@ -5397,6 +5667,16 @@
               </w:rPr>
               <w:t xml:space="preserve">Peer tester: </w:t>
             </w:r>
+            <w:r>
+              <w:rPr>
+                <w:rFonts w:ascii="Arial" w:eastAsia="Arial" w:hAnsi="Arial" w:cs="Arial"/>
+                <w:b/>
+                <w:bCs/>
+                <w:sz w:val="20"/>
+                <w:szCs w:val="20"/>
+              </w:rPr>
+              <w:t>Daniel Preller</w:t>
+            </w:r>
           </w:p>
           <w:p>
             <w:pPr>
@@ -5427,31 +5707,10 @@
             <w:r>
               <w:rPr>
                 <w:rFonts w:ascii="Arial" w:eastAsia="Arial" w:hAnsi="Arial" w:cs="Arial"/>
-                <w:color w:val="C00000"/>
-                <w:sz w:val="20"/>
-                <w:szCs w:val="20"/>
-              </w:rPr>
-              <w:t>&lt;</w:t>
-            </w:r>
-            <w:proofErr w:type="spellStart"/>
-            <w:r>
-              <w:rPr>
-                <w:rFonts w:ascii="Arial" w:eastAsia="Arial" w:hAnsi="Arial" w:cs="Arial"/>
-                <w:color w:val="C00000"/>
-                <w:sz w:val="20"/>
-                <w:szCs w:val="20"/>
-              </w:rPr>
-              <w:t>yyyy</w:t>
-            </w:r>
-            <w:proofErr w:type="spellEnd"/>
-            <w:r>
-              <w:rPr>
-                <w:rFonts w:ascii="Arial" w:eastAsia="Arial" w:hAnsi="Arial" w:cs="Arial"/>
-                <w:color w:val="C00000"/>
-                <w:sz w:val="20"/>
-                <w:szCs w:val="20"/>
-              </w:rPr>
-              <w:t>/mm/dd&gt;</w:t>
+                <w:sz w:val="20"/>
+                <w:szCs w:val="20"/>
+              </w:rPr>
+              <w:t>2026/10/11</w:t>
             </w:r>
           </w:p>
         </w:tc>
@@ -5619,6 +5878,7 @@
                 <w:sz w:val="20"/>
                 <w:szCs w:val="20"/>
               </w:rPr>
+              <w:lastRenderedPageBreak/>
               <w:t>1</w:t>
             </w:r>
           </w:p>
@@ -5678,7 +5938,6 @@
               <w:spacing w:before="80" w:after="80"/>
               <w:rPr>
                 <w:rFonts w:ascii="Arial" w:eastAsia="Arial" w:hAnsi="Arial" w:cs="Arial"/>
-                <w:color w:val="C00000"/>
                 <w:sz w:val="20"/>
                 <w:szCs w:val="20"/>
               </w:rPr>
@@ -5702,19 +5961,76 @@
               <w:spacing w:before="80" w:after="80"/>
               <w:rPr>
                 <w:rFonts w:ascii="Arial" w:eastAsia="Arial" w:hAnsi="Arial" w:cs="Arial"/>
-                <w:color w:val="C00000"/>
-                <w:sz w:val="20"/>
-                <w:szCs w:val="20"/>
-              </w:rPr>
-            </w:pPr>
-            <w:r>
-              <w:rPr>
-                <w:rFonts w:ascii="Arial" w:eastAsia="Arial" w:hAnsi="Arial" w:cs="Arial"/>
-                <w:color w:val="C00000"/>
-                <w:sz w:val="20"/>
-                <w:szCs w:val="20"/>
-              </w:rPr>
-              <w:t>&lt;yes/no&gt;</w:t>
+                <w:sz w:val="20"/>
+                <w:szCs w:val="20"/>
+              </w:rPr>
+            </w:pPr>
+            <w:r>
+              <w:rPr>
+                <w:rFonts w:ascii="Arial" w:eastAsia="Arial" w:hAnsi="Arial" w:cs="Arial"/>
+                <w:sz w:val="20"/>
+                <w:szCs w:val="20"/>
+              </w:rPr>
+              <w:t>yes</w:t>
+            </w:r>
+          </w:p>
+          <w:p>
+            <w:pPr>
+              <w:spacing w:before="80" w:after="80"/>
+              <w:rPr>
+                <w:rFonts w:ascii="Arial" w:eastAsia="Arial" w:hAnsi="Arial" w:cs="Arial"/>
+                <w:sz w:val="20"/>
+                <w:szCs w:val="20"/>
+              </w:rPr>
+            </w:pPr>
+            <w:r>
+              <w:rPr>
+                <w:rFonts w:ascii="Arial" w:eastAsia="Arial" w:hAnsi="Arial" w:cs="Arial"/>
+                <w:noProof/>
+                <w:sz w:val="20"/>
+                <w:szCs w:val="20"/>
+              </w:rPr>
+              <w:drawing>
+                <wp:inline distT="0" distB="0" distL="0" distR="0" wp14:anchorId="7AB27CBA" wp14:editId="0BF563AB">
+                  <wp:extent cx="1165860" cy="633730"/>
+                  <wp:effectExtent l="0" t="0" r="0" b="0"/>
+                  <wp:docPr id="1687425161" name="Picture 2"/>
+                  <wp:cNvGraphicFramePr>
+                    <a:graphicFrameLocks xmlns:a="http://schemas.openxmlformats.org/drawingml/2006/main" noChangeAspect="1"/>
+                  </wp:cNvGraphicFramePr>
+                  <a:graphic xmlns:a="http://schemas.openxmlformats.org/drawingml/2006/main">
+                    <a:graphicData uri="http://schemas.openxmlformats.org/drawingml/2006/picture">
+                      <pic:pic xmlns:pic="http://schemas.openxmlformats.org/drawingml/2006/picture">
+                        <pic:nvPicPr>
+                          <pic:cNvPr id="1687425161" name="Picture 1687425161"/>
+                          <pic:cNvPicPr/>
+                        </pic:nvPicPr>
+                        <pic:blipFill>
+                          <a:blip r:embed="rId7" cstate="print">
+                            <a:extLst>
+                              <a:ext uri="{28A0092B-C50C-407E-A947-70E740481C1C}">
+                                <a14:useLocalDpi xmlns:a14="http://schemas.microsoft.com/office/drawing/2010/main" val="0"/>
+                              </a:ext>
+                            </a:extLst>
+                          </a:blip>
+                          <a:stretch>
+                            <a:fillRect/>
+                          </a:stretch>
+                        </pic:blipFill>
+                        <pic:spPr>
+                          <a:xfrm>
+                            <a:off x="0" y="0"/>
+                            <a:ext cx="1165860" cy="633730"/>
+                          </a:xfrm>
+                          <a:prstGeom prst="rect">
+                            <a:avLst/>
+                          </a:prstGeom>
+                        </pic:spPr>
+                      </pic:pic>
+                    </a:graphicData>
+                  </a:graphic>
+                </wp:inline>
+              </w:drawing>
             </w:r>
           </w:p>
         </w:tc>
@@ -5811,7 +6127,6 @@
               <w:spacing w:before="80" w:after="80"/>
               <w:rPr>
                 <w:rFonts w:ascii="Arial" w:eastAsia="Arial" w:hAnsi="Arial" w:cs="Arial"/>
-                <w:color w:val="C00000"/>
                 <w:sz w:val="20"/>
                 <w:szCs w:val="20"/>
               </w:rPr>
@@ -5835,19 +6150,76 @@
               <w:spacing w:before="80" w:after="80"/>
               <w:rPr>
                 <w:rFonts w:ascii="Arial" w:eastAsia="Arial" w:hAnsi="Arial" w:cs="Arial"/>
-                <w:color w:val="C00000"/>
-                <w:sz w:val="20"/>
-                <w:szCs w:val="20"/>
-              </w:rPr>
-            </w:pPr>
-            <w:r>
-              <w:rPr>
-                <w:rFonts w:ascii="Arial" w:eastAsia="Arial" w:hAnsi="Arial" w:cs="Arial"/>
-                <w:color w:val="C00000"/>
-                <w:sz w:val="20"/>
-                <w:szCs w:val="20"/>
-              </w:rPr>
-              <w:t>&lt;yes/no&gt;</w:t>
+                <w:sz w:val="20"/>
+                <w:szCs w:val="20"/>
+              </w:rPr>
+            </w:pPr>
+            <w:r>
+              <w:rPr>
+                <w:rFonts w:ascii="Arial" w:eastAsia="Arial" w:hAnsi="Arial" w:cs="Arial"/>
+                <w:sz w:val="20"/>
+                <w:szCs w:val="20"/>
+              </w:rPr>
+              <w:t>yes</w:t>
+            </w:r>
+          </w:p>
+          <w:p>
+            <w:pPr>
+              <w:spacing w:before="80" w:after="80"/>
+              <w:rPr>
+                <w:rFonts w:ascii="Arial" w:eastAsia="Arial" w:hAnsi="Arial" w:cs="Arial"/>
+                <w:sz w:val="20"/>
+                <w:szCs w:val="20"/>
+              </w:rPr>
+            </w:pPr>
+            <w:r>
+              <w:rPr>
+                <w:rFonts w:ascii="Arial" w:eastAsia="Arial" w:hAnsi="Arial" w:cs="Arial"/>
+                <w:noProof/>
+                <w:sz w:val="20"/>
+                <w:szCs w:val="20"/>
+              </w:rPr>
+              <w:drawing>
+                <wp:inline distT="0" distB="0" distL="0" distR="0" wp14:anchorId="2EE20F39" wp14:editId="552FC64E">
+                  <wp:extent cx="1165860" cy="633730"/>
+                  <wp:effectExtent l="0" t="0" r="0" b="0"/>
+                  <wp:docPr id="1100249282" name="Picture 3"/>
+                  <wp:cNvGraphicFramePr>
+                    <a:graphicFrameLocks xmlns:a="http://schemas.openxmlformats.org/drawingml/2006/main" noChangeAspect="1"/>
+                  </wp:cNvGraphicFramePr>
+                  <a:graphic xmlns:a="http://schemas.openxmlformats.org/drawingml/2006/main">
+                    <a:graphicData uri="http://schemas.openxmlformats.org/drawingml/2006/picture">
+                      <pic:pic xmlns:pic="http://schemas.openxmlformats.org/drawingml/2006/picture">
+                        <pic:nvPicPr>
+                          <pic:cNvPr id="1100249282" name="Picture 1100249282"/>
+                          <pic:cNvPicPr/>
+                        </pic:nvPicPr>
+                        <pic:blipFill>
+                          <a:blip r:embed="rId8" cstate="print">
+                            <a:extLst>
+                              <a:ext uri="{28A0092B-C50C-407E-A947-70E740481C1C}">
+                                <a14:useLocalDpi xmlns:a14="http://schemas.microsoft.com/office/drawing/2010/main" val="0"/>
+                              </a:ext>
+                            </a:extLst>
+                          </a:blip>
+                          <a:stretch>
+                            <a:fillRect/>
+                          </a:stretch>
+                        </pic:blipFill>
+                        <pic:spPr>
+                          <a:xfrm>
+                            <a:off x="0" y="0"/>
+                            <a:ext cx="1165860" cy="633730"/>
+                          </a:xfrm>
+                          <a:prstGeom prst="rect">
+                            <a:avLst/>
+                          </a:prstGeom>
+                        </pic:spPr>
+                      </pic:pic>
+                    </a:graphicData>
+                  </a:graphic>
+                </wp:inline>
+              </w:drawing>
             </w:r>
           </w:p>
         </w:tc>
@@ -5934,7 +6306,6 @@
               <w:spacing w:before="80" w:after="80"/>
               <w:rPr>
                 <w:rFonts w:ascii="Arial" w:eastAsia="Arial" w:hAnsi="Arial" w:cs="Arial"/>
-                <w:color w:val="C00000"/>
                 <w:sz w:val="20"/>
                 <w:szCs w:val="20"/>
               </w:rPr>
@@ -5958,19 +6329,17 @@
               <w:spacing w:before="80" w:after="80"/>
               <w:rPr>
                 <w:rFonts w:ascii="Arial" w:eastAsia="Arial" w:hAnsi="Arial" w:cs="Arial"/>
-                <w:color w:val="C00000"/>
-                <w:sz w:val="20"/>
-                <w:szCs w:val="20"/>
-              </w:rPr>
-            </w:pPr>
-            <w:r>
-              <w:rPr>
-                <w:rFonts w:ascii="Arial" w:eastAsia="Arial" w:hAnsi="Arial" w:cs="Arial"/>
-                <w:color w:val="C00000"/>
-                <w:sz w:val="20"/>
-                <w:szCs w:val="20"/>
-              </w:rPr>
-              <w:t>&lt;yes/no&gt;</w:t>
+                <w:sz w:val="20"/>
+                <w:szCs w:val="20"/>
+              </w:rPr>
+            </w:pPr>
+            <w:r>
+              <w:rPr>
+                <w:rFonts w:ascii="Arial" w:eastAsia="Arial" w:hAnsi="Arial" w:cs="Arial"/>
+                <w:sz w:val="20"/>
+                <w:szCs w:val="20"/>
+              </w:rPr>
+              <w:t>yes</w:t>
             </w:r>
           </w:p>
         </w:tc>
@@ -5998,7 +6367,6 @@
                 <w:sz w:val="20"/>
                 <w:szCs w:val="20"/>
               </w:rPr>
-              <w:lastRenderedPageBreak/>
               <w:t>4</w:t>
             </w:r>
           </w:p>
@@ -6068,7 +6436,6 @@
               <w:spacing w:before="80" w:after="80"/>
               <w:rPr>
                 <w:rFonts w:ascii="Arial" w:eastAsia="Arial" w:hAnsi="Arial" w:cs="Arial"/>
-                <w:color w:val="C00000"/>
                 <w:sz w:val="20"/>
                 <w:szCs w:val="20"/>
               </w:rPr>
@@ -6092,19 +6459,76 @@
               <w:spacing w:before="80" w:after="80"/>
               <w:rPr>
                 <w:rFonts w:ascii="Arial" w:eastAsia="Arial" w:hAnsi="Arial" w:cs="Arial"/>
-                <w:color w:val="C00000"/>
-                <w:sz w:val="20"/>
-                <w:szCs w:val="20"/>
-              </w:rPr>
-            </w:pPr>
-            <w:r>
-              <w:rPr>
-                <w:rFonts w:ascii="Arial" w:eastAsia="Arial" w:hAnsi="Arial" w:cs="Arial"/>
-                <w:color w:val="C00000"/>
-                <w:sz w:val="20"/>
-                <w:szCs w:val="20"/>
-              </w:rPr>
-              <w:t>&lt;yes/no&gt;</w:t>
+                <w:sz w:val="20"/>
+                <w:szCs w:val="20"/>
+              </w:rPr>
+            </w:pPr>
+            <w:r>
+              <w:rPr>
+                <w:rFonts w:ascii="Arial" w:eastAsia="Arial" w:hAnsi="Arial" w:cs="Arial"/>
+                <w:sz w:val="20"/>
+                <w:szCs w:val="20"/>
+              </w:rPr>
+              <w:t>yes</w:t>
+            </w:r>
+          </w:p>
+          <w:p>
+            <w:pPr>
+              <w:spacing w:before="80" w:after="80"/>
+              <w:rPr>
+                <w:rFonts w:ascii="Arial" w:eastAsia="Arial" w:hAnsi="Arial" w:cs="Arial"/>
+                <w:sz w:val="20"/>
+                <w:szCs w:val="20"/>
+              </w:rPr>
+            </w:pPr>
+            <w:r>
+              <w:rPr>
+                <w:rFonts w:ascii="Arial" w:eastAsia="Arial" w:hAnsi="Arial" w:cs="Arial"/>
+                <w:noProof/>
+                <w:sz w:val="20"/>
+                <w:szCs w:val="20"/>
+              </w:rPr>
+              <w:drawing>
+                <wp:inline distT="0" distB="0" distL="0" distR="0" wp14:anchorId="2231EBB5" wp14:editId="4990DB09">
+                  <wp:extent cx="1165860" cy="396875"/>
+                  <wp:effectExtent l="0" t="0" r="0" b="3175"/>
+                  <wp:docPr id="146644883" name="Picture 4"/>
+                  <wp:cNvGraphicFramePr>
+                    <a:graphicFrameLocks xmlns:a="http://schemas.openxmlformats.org/drawingml/2006/main" noChangeAspect="1"/>
+                  </wp:cNvGraphicFramePr>
+                  <a:graphic xmlns:a="http://schemas.openxmlformats.org/drawingml/2006/main">
+                    <a:graphicData uri="http://schemas.openxmlformats.org/drawingml/2006/picture">
+                      <pic:pic xmlns:pic="http://schemas.openxmlformats.org/drawingml/2006/picture">
+                        <pic:nvPicPr>
+                          <pic:cNvPr id="146644883" name="Picture 146644883"/>
+                          <pic:cNvPicPr/>
+                        </pic:nvPicPr>
+                        <pic:blipFill>
+                          <a:blip r:embed="rId9" cstate="print">
+                            <a:extLst>
+                              <a:ext uri="{28A0092B-C50C-407E-A947-70E740481C1C}">
+                                <a14:useLocalDpi xmlns:a14="http://schemas.microsoft.com/office/drawing/2010/main" val="0"/>
+                              </a:ext>
+                            </a:extLst>
+                          </a:blip>
+                          <a:stretch>
+                            <a:fillRect/>
+                          </a:stretch>
+                        </pic:blipFill>
+                        <pic:spPr>
+                          <a:xfrm>
+                            <a:off x="0" y="0"/>
+                            <a:ext cx="1165860" cy="396875"/>
+                          </a:xfrm>
+                          <a:prstGeom prst="rect">
+                            <a:avLst/>
+                          </a:prstGeom>
+                        </pic:spPr>
+                      </pic:pic>
+                    </a:graphicData>
+                  </a:graphic>
+                </wp:inline>
+              </w:drawing>
             </w:r>
           </w:p>
         </w:tc>
@@ -6191,7 +6615,6 @@
               <w:spacing w:before="80" w:after="80"/>
               <w:rPr>
                 <w:rFonts w:ascii="Arial" w:eastAsia="Arial" w:hAnsi="Arial" w:cs="Arial"/>
-                <w:color w:val="C00000"/>
                 <w:sz w:val="20"/>
                 <w:szCs w:val="20"/>
               </w:rPr>
@@ -6215,19 +6638,17 @@
               <w:spacing w:before="80" w:after="80"/>
               <w:rPr>
                 <w:rFonts w:ascii="Arial" w:eastAsia="Arial" w:hAnsi="Arial" w:cs="Arial"/>
-                <w:color w:val="C00000"/>
-                <w:sz w:val="20"/>
-                <w:szCs w:val="20"/>
-              </w:rPr>
-            </w:pPr>
-            <w:r>
-              <w:rPr>
-                <w:rFonts w:ascii="Arial" w:eastAsia="Arial" w:hAnsi="Arial" w:cs="Arial"/>
-                <w:color w:val="C00000"/>
-                <w:sz w:val="20"/>
-                <w:szCs w:val="20"/>
-              </w:rPr>
-              <w:t>&lt;yes/no&gt;</w:t>
+                <w:sz w:val="20"/>
+                <w:szCs w:val="20"/>
+              </w:rPr>
+            </w:pPr>
+            <w:r>
+              <w:rPr>
+                <w:rFonts w:ascii="Arial" w:eastAsia="Arial" w:hAnsi="Arial" w:cs="Arial"/>
+                <w:sz w:val="20"/>
+                <w:szCs w:val="20"/>
+              </w:rPr>
+              <w:t>yes</w:t>
             </w:r>
           </w:p>
         </w:tc>
@@ -6314,7 +6735,6 @@
               <w:spacing w:before="80" w:after="80"/>
               <w:rPr>
                 <w:rFonts w:ascii="Arial" w:eastAsia="Arial" w:hAnsi="Arial" w:cs="Arial"/>
-                <w:color w:val="C00000"/>
                 <w:sz w:val="20"/>
                 <w:szCs w:val="20"/>
               </w:rPr>
@@ -6338,11 +6758,18 @@
               <w:spacing w:before="80" w:after="80"/>
               <w:rPr>
                 <w:rFonts w:ascii="Arial" w:eastAsia="Arial" w:hAnsi="Arial" w:cs="Arial"/>
-                <w:color w:val="C00000"/>
-                <w:sz w:val="20"/>
-                <w:szCs w:val="20"/>
-              </w:rPr>
-            </w:pPr>
+                <w:sz w:val="20"/>
+                <w:szCs w:val="20"/>
+              </w:rPr>
+            </w:pPr>
+            <w:r>
+              <w:rPr>
+                <w:rFonts w:ascii="Arial" w:eastAsia="Arial" w:hAnsi="Arial" w:cs="Arial"/>
+                <w:sz w:val="20"/>
+                <w:szCs w:val="20"/>
+              </w:rPr>
+              <w:t>yes</w:t>
+            </w:r>
           </w:p>
         </w:tc>
       </w:tr>
@@ -6387,19 +6814,17 @@
               <w:spacing w:before="80" w:after="80"/>
               <w:rPr>
                 <w:rFonts w:ascii="Arial" w:eastAsia="Arial" w:hAnsi="Arial" w:cs="Arial"/>
-                <w:color w:val="C00000"/>
-                <w:sz w:val="20"/>
-                <w:szCs w:val="20"/>
-              </w:rPr>
-            </w:pPr>
-            <w:r>
-              <w:rPr>
-                <w:rFonts w:ascii="Arial" w:eastAsia="Arial" w:hAnsi="Arial" w:cs="Arial"/>
-                <w:color w:val="C00000"/>
-                <w:sz w:val="20"/>
-                <w:szCs w:val="20"/>
-              </w:rPr>
-              <w:t>Comments should be substantive; this means there should be at least 2-3 well-structured sentences with constructive feedback.</w:t>
+                <w:sz w:val="20"/>
+                <w:szCs w:val="20"/>
+              </w:rPr>
+            </w:pPr>
+            <w:r>
+              <w:rPr>
+                <w:rFonts w:ascii="Arial" w:eastAsia="Arial" w:hAnsi="Arial" w:cs="Arial"/>
+                <w:sz w:val="20"/>
+                <w:szCs w:val="20"/>
+              </w:rPr>
+              <w:t>Pages load quickly and have clear navigation. One possible improvement could be to have the return button go back to the previous page, regardless of whether it was the index.</w:t>
             </w:r>
           </w:p>
         </w:tc>
@@ -6478,6 +6903,7 @@
                 <w:sz w:val="24"/>
                 <w:szCs w:val="24"/>
               </w:rPr>
+              <w:lastRenderedPageBreak/>
               <w:t>Test 5</w:t>
             </w:r>
           </w:p>
@@ -6490,15 +6916,13 @@
           <w:p>
             <w:pPr>
               <w:pStyle w:val="Heading1"/>
-              <w:outlineLvl w:val="0"/>
-              <w:rPr>
-                <w:rFonts w:ascii="Arial" w:eastAsia="Arial" w:hAnsi="Arial" w:cs="Arial"/>
-                <w:b/>
-                <w:bCs/>
-              </w:rPr>
-            </w:pPr>
-            <w:bookmarkStart w:id="2" w:name="_heading=h.gat4iv42bcug" w:colFirst="0" w:colLast="0"/>
-            <w:bookmarkEnd w:id="2"/>
+              <w:rPr>
+                <w:rFonts w:ascii="Arial" w:eastAsia="Arial" w:hAnsi="Arial" w:cs="Arial"/>
+                <w:b/>
+                <w:bCs/>
+              </w:rPr>
+            </w:pPr>
+            <w:bookmarkStart w:id="4" w:name="_Toc242638368"/>
             <w:r>
               <w:rPr>
                 <w:rFonts w:ascii="Arial" w:eastAsia="Arial" w:hAnsi="Arial" w:cs="Arial"/>
@@ -6508,6 +6932,7 @@
               </w:rPr>
               <w:t>Login normally</w:t>
             </w:r>
+            <w:bookmarkEnd w:id="4"/>
           </w:p>
         </w:tc>
       </w:tr>
@@ -7466,7 +7891,7 @@
                           <pic:cNvPicPr/>
                         </pic:nvPicPr>
                         <pic:blipFill>
-                          <a:blip r:embed="rId7" cstate="print">
+                          <a:blip r:embed="rId10" cstate="print">
                             <a:extLst>
                               <a:ext uri="{28A0092B-C50C-407E-A947-70E740481C1C}">
                                 <a14:useLocalDpi xmlns:a14="http://schemas.microsoft.com/office/drawing/2010/main" val="0"/>
@@ -7799,15 +8224,13 @@
           <w:p>
             <w:pPr>
               <w:pStyle w:val="Heading1"/>
-              <w:outlineLvl w:val="0"/>
-              <w:rPr>
-                <w:rFonts w:ascii="Arial" w:eastAsia="Arial" w:hAnsi="Arial" w:cs="Arial"/>
-                <w:b/>
-                <w:bCs/>
-              </w:rPr>
-            </w:pPr>
-            <w:bookmarkStart w:id="3" w:name="_heading=h.tdkw0xvd0kd3" w:colFirst="0" w:colLast="0"/>
-            <w:bookmarkEnd w:id="3"/>
+              <w:rPr>
+                <w:rFonts w:ascii="Arial" w:eastAsia="Arial" w:hAnsi="Arial" w:cs="Arial"/>
+                <w:b/>
+                <w:bCs/>
+              </w:rPr>
+            </w:pPr>
+            <w:bookmarkStart w:id="5" w:name="_Toc242638369"/>
             <w:r>
               <w:rPr>
                 <w:rFonts w:ascii="Arial" w:eastAsia="Arial" w:hAnsi="Arial" w:cs="Arial"/>
@@ -7817,6 +8240,7 @@
               </w:rPr>
               <w:t>Login with errors</w:t>
             </w:r>
+            <w:bookmarkEnd w:id="5"/>
           </w:p>
         </w:tc>
       </w:tr>
@@ -8968,7 +9392,7 @@
                 <w:szCs w:val="20"/>
               </w:rPr>
               <w:drawing>
-                <wp:inline distT="0" distB="0" distL="0" distR="0">
+                <wp:inline distT="0" distB="0" distL="0" distR="0" wp14:anchorId="5E4638C6" wp14:editId="46FCE1F7">
                   <wp:extent cx="1226820" cy="953135"/>
                   <wp:effectExtent l="0" t="0" r="5080" b="0"/>
                   <wp:docPr id="1366861744" name="Picture 2" descr="A screenshot of a computer&#10;&#10;AI-generated content may be incorrect."/>
@@ -8983,7 +9407,7 @@
                           <pic:cNvPicPr/>
                         </pic:nvPicPr>
                         <pic:blipFill>
-                          <a:blip r:embed="rId8" cstate="print">
+                          <a:blip r:embed="rId11" cstate="print">
                             <a:extLst>
                               <a:ext uri="{28A0092B-C50C-407E-A947-70E740481C1C}">
                                 <a14:useLocalDpi xmlns:a14="http://schemas.microsoft.com/office/drawing/2010/main" val="0"/>
@@ -9241,8 +9665,8 @@
       </w:pPr>
     </w:p>
     <w:sectPr>
-      <w:headerReference w:type="default" r:id="rId9"/>
-      <w:footerReference w:type="default" r:id="rId10"/>
+      <w:headerReference w:type="default" r:id="rId12"/>
+      <w:footerReference w:type="default" r:id="rId13"/>
       <w:pgSz w:w="15840" w:h="12240" w:orient="landscape"/>
       <w:pgMar w:top="1440" w:right="1440" w:bottom="1440" w:left="1440" w:header="720" w:footer="720" w:gutter="0"/>
       <w:pgNumType w:start="1"/>

</xml_diff>

<commit_message>
Updated test plans with two more peer tests
</commit_message>
<xml_diff>
--- a/module-5/TestPlanTemplate.docx
+++ b/module-5/TestPlanTemplate.docx
@@ -436,7 +436,7 @@
           <w:r>
             <w:fldChar w:fldCharType="separate"/>
           </w:r>
-          <w:hyperlink w:anchor="_Toc242638364" w:history="1">
+          <w:hyperlink w:anchor="_Toc242649737" w:history="1">
             <w:r>
               <w:rPr>
                 <w:rStyle w:val="Hyperlink"/>
@@ -466,7 +466,7 @@
                 <w:noProof/>
                 <w:webHidden/>
               </w:rPr>
-              <w:instrText xml:space="preserve"> PAGEREF _Toc242638364 \h </w:instrText>
+              <w:instrText xml:space="preserve"> PAGEREF _Toc242649737 \h </w:instrText>
             </w:r>
             <w:r>
               <w:rPr>
@@ -513,7 +513,7 @@
               <w14:ligatures w14:val="standardContextual"/>
             </w:rPr>
           </w:pPr>
-          <w:hyperlink w:anchor="_Toc242638365" w:history="1">
+          <w:hyperlink w:anchor="_Toc242649738" w:history="1">
             <w:r>
               <w:rPr>
                 <w:rStyle w:val="Hyperlink"/>
@@ -543,7 +543,7 @@
                 <w:noProof/>
                 <w:webHidden/>
               </w:rPr>
-              <w:instrText xml:space="preserve"> PAGEREF _Toc242638365 \h </w:instrText>
+              <w:instrText xml:space="preserve"> PAGEREF _Toc242649738 \h </w:instrText>
             </w:r>
             <w:r>
               <w:rPr>
@@ -590,7 +590,7 @@
               <w14:ligatures w14:val="standardContextual"/>
             </w:rPr>
           </w:pPr>
-          <w:hyperlink w:anchor="_Toc242638366" w:history="1">
+          <w:hyperlink w:anchor="_Toc242649739" w:history="1">
             <w:r>
               <w:rPr>
                 <w:rStyle w:val="Hyperlink"/>
@@ -620,7 +620,7 @@
                 <w:noProof/>
                 <w:webHidden/>
               </w:rPr>
-              <w:instrText xml:space="preserve"> PAGEREF _Toc242638366 \h </w:instrText>
+              <w:instrText xml:space="preserve"> PAGEREF _Toc242649739 \h </w:instrText>
             </w:r>
             <w:r>
               <w:rPr>
@@ -667,7 +667,7 @@
               <w14:ligatures w14:val="standardContextual"/>
             </w:rPr>
           </w:pPr>
-          <w:hyperlink w:anchor="_Toc242638367" w:history="1">
+          <w:hyperlink w:anchor="_Toc242649740" w:history="1">
             <w:r>
               <w:rPr>
                 <w:rStyle w:val="Hyperlink"/>
@@ -697,7 +697,7 @@
                 <w:noProof/>
                 <w:webHidden/>
               </w:rPr>
-              <w:instrText xml:space="preserve"> PAGEREF _Toc242638367 \h </w:instrText>
+              <w:instrText xml:space="preserve"> PAGEREF _Toc242649740 \h </w:instrText>
             </w:r>
             <w:r>
               <w:rPr>
@@ -744,7 +744,7 @@
               <w14:ligatures w14:val="standardContextual"/>
             </w:rPr>
           </w:pPr>
-          <w:hyperlink w:anchor="_Toc242638368" w:history="1">
+          <w:hyperlink w:anchor="_Toc242649741" w:history="1">
             <w:r>
               <w:rPr>
                 <w:rStyle w:val="Hyperlink"/>
@@ -774,7 +774,7 @@
                 <w:noProof/>
                 <w:webHidden/>
               </w:rPr>
-              <w:instrText xml:space="preserve"> PAGEREF _Toc242638368 \h </w:instrText>
+              <w:instrText xml:space="preserve"> PAGEREF _Toc242649741 \h </w:instrText>
             </w:r>
             <w:r>
               <w:rPr>
@@ -821,7 +821,7 @@
               <w14:ligatures w14:val="standardContextual"/>
             </w:rPr>
           </w:pPr>
-          <w:hyperlink w:anchor="_Toc242638369" w:history="1">
+          <w:hyperlink w:anchor="_Toc242649742" w:history="1">
             <w:r>
               <w:rPr>
                 <w:rStyle w:val="Hyperlink"/>
@@ -851,7 +851,7 @@
                 <w:noProof/>
                 <w:webHidden/>
               </w:rPr>
-              <w:instrText xml:space="preserve"> PAGEREF _Toc242638369 \h </w:instrText>
+              <w:instrText xml:space="preserve"> PAGEREF _Toc242649742 \h </w:instrText>
             </w:r>
             <w:r>
               <w:rPr>
@@ -1363,7 +1363,7 @@
                 <w:bCs/>
               </w:rPr>
             </w:pPr>
-            <w:bookmarkStart w:id="0" w:name="_Toc242638364"/>
+            <w:bookmarkStart w:id="0" w:name="_Toc242649737"/>
             <w:r>
               <w:rPr>
                 <w:rFonts w:ascii="Arial" w:eastAsia="Arial" w:hAnsi="Arial" w:cs="Arial"/>
@@ -2508,7 +2508,7 @@
                 <w:bCs/>
               </w:rPr>
             </w:pPr>
-            <w:bookmarkStart w:id="1" w:name="_Toc242638365"/>
+            <w:bookmarkStart w:id="1" w:name="_Toc242649738"/>
             <w:r>
               <w:rPr>
                 <w:rFonts w:ascii="Arial" w:eastAsia="Arial" w:hAnsi="Arial" w:cs="Arial"/>
@@ -3971,7 +3971,7 @@
                 <w:bCs/>
               </w:rPr>
             </w:pPr>
-            <w:bookmarkStart w:id="2" w:name="_Toc242638366"/>
+            <w:bookmarkStart w:id="2" w:name="_Toc242649739"/>
             <w:r>
               <w:rPr>
                 <w:rFonts w:ascii="Arial" w:eastAsia="Arial" w:hAnsi="Arial" w:cs="Arial"/>
@@ -4748,7 +4748,7 @@
                           <pic:cNvPicPr/>
                         </pic:nvPicPr>
                         <pic:blipFill>
-                          <a:blip r:embed="rId7" cstate="print">
+                          <a:blip r:embed="rId8" cstate="print">
                             <a:extLst>
                               <a:ext uri="{28A0092B-C50C-407E-A947-70E740481C1C}">
                                 <a14:useLocalDpi xmlns:a14="http://schemas.microsoft.com/office/drawing/2010/main" val="0"/>
@@ -5524,7 +5524,7 @@
                 <w:bCs/>
               </w:rPr>
             </w:pPr>
-            <w:bookmarkStart w:id="3" w:name="_Toc242638367"/>
+            <w:bookmarkStart w:id="3" w:name="_Toc242649740"/>
             <w:r>
               <w:rPr>
                 <w:rFonts w:ascii="Arial" w:eastAsia="Arial" w:hAnsi="Arial" w:cs="Arial"/>
@@ -6003,195 +6003,6 @@
                       <pic:pic xmlns:pic="http://schemas.openxmlformats.org/drawingml/2006/picture">
                         <pic:nvPicPr>
                           <pic:cNvPr id="1687425161" name="Picture 1687425161"/>
-                          <pic:cNvPicPr/>
-                        </pic:nvPicPr>
-                        <pic:blipFill>
-                          <a:blip r:embed="rId7" cstate="print">
-                            <a:extLst>
-                              <a:ext uri="{28A0092B-C50C-407E-A947-70E740481C1C}">
-                                <a14:useLocalDpi xmlns:a14="http://schemas.microsoft.com/office/drawing/2010/main" val="0"/>
-                              </a:ext>
-                            </a:extLst>
-                          </a:blip>
-                          <a:stretch>
-                            <a:fillRect/>
-                          </a:stretch>
-                        </pic:blipFill>
-                        <pic:spPr>
-                          <a:xfrm>
-                            <a:off x="0" y="0"/>
-                            <a:ext cx="1165860" cy="633730"/>
-                          </a:xfrm>
-                          <a:prstGeom prst="rect">
-                            <a:avLst/>
-                          </a:prstGeom>
-                        </pic:spPr>
-                      </pic:pic>
-                    </a:graphicData>
-                  </a:graphic>
-                </wp:inline>
-              </w:drawing>
-            </w:r>
-          </w:p>
-        </w:tc>
-      </w:tr>
-      <w:tr>
-        <w:trPr>
-          <w:trHeight w:val="350"/>
-        </w:trPr>
-        <w:tc>
-          <w:tcPr>
-            <w:tcW w:w="1250" w:type="dxa"/>
-          </w:tcPr>
-          <w:p>
-            <w:pPr>
-              <w:spacing w:before="80" w:after="80"/>
-              <w:rPr>
-                <w:rFonts w:ascii="Arial" w:eastAsia="Arial" w:hAnsi="Arial" w:cs="Arial"/>
-                <w:sz w:val="20"/>
-                <w:szCs w:val="20"/>
-              </w:rPr>
-            </w:pPr>
-            <w:r>
-              <w:rPr>
-                <w:rFonts w:ascii="Arial" w:eastAsia="Arial" w:hAnsi="Arial" w:cs="Arial"/>
-                <w:sz w:val="20"/>
-                <w:szCs w:val="20"/>
-              </w:rPr>
-              <w:t>2</w:t>
-            </w:r>
-          </w:p>
-        </w:tc>
-        <w:tc>
-          <w:tcPr>
-            <w:tcW w:w="3570" w:type="dxa"/>
-          </w:tcPr>
-          <w:p>
-            <w:pPr>
-              <w:spacing w:before="80" w:after="80"/>
-              <w:rPr>
-                <w:rFonts w:ascii="Arial" w:eastAsia="Arial" w:hAnsi="Arial" w:cs="Arial"/>
-                <w:sz w:val="20"/>
-                <w:szCs w:val="20"/>
-              </w:rPr>
-            </w:pPr>
-            <w:r>
-              <w:rPr>
-                <w:rFonts w:ascii="Arial" w:eastAsia="Arial" w:hAnsi="Arial" w:cs="Arial"/>
-                <w:sz w:val="20"/>
-                <w:szCs w:val="20"/>
-              </w:rPr>
-              <w:t>Click the Login Button (navbar)</w:t>
-            </w:r>
-          </w:p>
-        </w:tc>
-        <w:tc>
-          <w:tcPr>
-            <w:tcW w:w="3930" w:type="dxa"/>
-          </w:tcPr>
-          <w:p>
-            <w:pPr>
-              <w:spacing w:before="80" w:after="80"/>
-              <w:rPr>
-                <w:rFonts w:ascii="Arial" w:eastAsia="Arial" w:hAnsi="Arial" w:cs="Arial"/>
-                <w:sz w:val="20"/>
-                <w:szCs w:val="20"/>
-              </w:rPr>
-            </w:pPr>
-            <w:r>
-              <w:rPr>
-                <w:rFonts w:ascii="Arial" w:eastAsia="Arial" w:hAnsi="Arial" w:cs="Arial"/>
-                <w:sz w:val="20"/>
-                <w:szCs w:val="20"/>
-              </w:rPr>
-              <w:t xml:space="preserve">Browser redirects to </w:t>
-            </w:r>
-            <w:proofErr w:type="spellStart"/>
-            <w:r>
-              <w:rPr>
-                <w:rFonts w:ascii="Arial" w:eastAsia="Arial" w:hAnsi="Arial" w:cs="Arial"/>
-                <w:sz w:val="20"/>
-                <w:szCs w:val="20"/>
-              </w:rPr>
-              <w:t>login.jsp</w:t>
-            </w:r>
-            <w:proofErr w:type="spellEnd"/>
-          </w:p>
-        </w:tc>
-        <w:tc>
-          <w:tcPr>
-            <w:tcW w:w="2148" w:type="dxa"/>
-          </w:tcPr>
-          <w:p>
-            <w:pPr>
-              <w:spacing w:before="80" w:after="80"/>
-              <w:rPr>
-                <w:rFonts w:ascii="Arial" w:eastAsia="Arial" w:hAnsi="Arial" w:cs="Arial"/>
-                <w:sz w:val="20"/>
-                <w:szCs w:val="20"/>
-              </w:rPr>
-            </w:pPr>
-            <w:r>
-              <w:rPr>
-                <w:rFonts w:ascii="Arial" w:eastAsia="Arial" w:hAnsi="Arial" w:cs="Arial"/>
-                <w:sz w:val="20"/>
-                <w:szCs w:val="20"/>
-              </w:rPr>
-              <w:t>yes</w:t>
-            </w:r>
-          </w:p>
-        </w:tc>
-        <w:tc>
-          <w:tcPr>
-            <w:tcW w:w="2052" w:type="dxa"/>
-          </w:tcPr>
-          <w:p>
-            <w:pPr>
-              <w:spacing w:before="80" w:after="80"/>
-              <w:rPr>
-                <w:rFonts w:ascii="Arial" w:eastAsia="Arial" w:hAnsi="Arial" w:cs="Arial"/>
-                <w:sz w:val="20"/>
-                <w:szCs w:val="20"/>
-              </w:rPr>
-            </w:pPr>
-            <w:r>
-              <w:rPr>
-                <w:rFonts w:ascii="Arial" w:eastAsia="Arial" w:hAnsi="Arial" w:cs="Arial"/>
-                <w:sz w:val="20"/>
-                <w:szCs w:val="20"/>
-              </w:rPr>
-              <w:t>yes</w:t>
-            </w:r>
-          </w:p>
-          <w:p>
-            <w:pPr>
-              <w:spacing w:before="80" w:after="80"/>
-              <w:rPr>
-                <w:rFonts w:ascii="Arial" w:eastAsia="Arial" w:hAnsi="Arial" w:cs="Arial"/>
-                <w:sz w:val="20"/>
-                <w:szCs w:val="20"/>
-              </w:rPr>
-            </w:pPr>
-            <w:r>
-              <w:rPr>
-                <w:rFonts w:ascii="Arial" w:eastAsia="Arial" w:hAnsi="Arial" w:cs="Arial"/>
-                <w:noProof/>
-                <w:sz w:val="20"/>
-                <w:szCs w:val="20"/>
-              </w:rPr>
-              <w:drawing>
-                <wp:inline distT="0" distB="0" distL="0" distR="0" wp14:anchorId="2EE20F39" wp14:editId="552FC64E">
-                  <wp:extent cx="1165860" cy="633730"/>
-                  <wp:effectExtent l="0" t="0" r="0" b="0"/>
-                  <wp:docPr id="1100249282" name="Picture 3"/>
-                  <wp:cNvGraphicFramePr>
-                    <a:graphicFrameLocks xmlns:a="http://schemas.openxmlformats.org/drawingml/2006/main" noChangeAspect="1"/>
-                  </wp:cNvGraphicFramePr>
-                  <a:graphic xmlns:a="http://schemas.openxmlformats.org/drawingml/2006/main">
-                    <a:graphicData uri="http://schemas.openxmlformats.org/drawingml/2006/picture">
-                      <pic:pic xmlns:pic="http://schemas.openxmlformats.org/drawingml/2006/picture">
-                        <pic:nvPicPr>
-                          <pic:cNvPr id="1100249282" name="Picture 1100249282"/>
                           <pic:cNvPicPr/>
                         </pic:nvPicPr>
                         <pic:blipFill>
@@ -6247,6 +6058,195 @@
                 <w:sz w:val="20"/>
                 <w:szCs w:val="20"/>
               </w:rPr>
+              <w:t>2</w:t>
+            </w:r>
+          </w:p>
+        </w:tc>
+        <w:tc>
+          <w:tcPr>
+            <w:tcW w:w="3570" w:type="dxa"/>
+          </w:tcPr>
+          <w:p>
+            <w:pPr>
+              <w:spacing w:before="80" w:after="80"/>
+              <w:rPr>
+                <w:rFonts w:ascii="Arial" w:eastAsia="Arial" w:hAnsi="Arial" w:cs="Arial"/>
+                <w:sz w:val="20"/>
+                <w:szCs w:val="20"/>
+              </w:rPr>
+            </w:pPr>
+            <w:r>
+              <w:rPr>
+                <w:rFonts w:ascii="Arial" w:eastAsia="Arial" w:hAnsi="Arial" w:cs="Arial"/>
+                <w:sz w:val="20"/>
+                <w:szCs w:val="20"/>
+              </w:rPr>
+              <w:t>Click the Login Button (navbar)</w:t>
+            </w:r>
+          </w:p>
+        </w:tc>
+        <w:tc>
+          <w:tcPr>
+            <w:tcW w:w="3930" w:type="dxa"/>
+          </w:tcPr>
+          <w:p>
+            <w:pPr>
+              <w:spacing w:before="80" w:after="80"/>
+              <w:rPr>
+                <w:rFonts w:ascii="Arial" w:eastAsia="Arial" w:hAnsi="Arial" w:cs="Arial"/>
+                <w:sz w:val="20"/>
+                <w:szCs w:val="20"/>
+              </w:rPr>
+            </w:pPr>
+            <w:r>
+              <w:rPr>
+                <w:rFonts w:ascii="Arial" w:eastAsia="Arial" w:hAnsi="Arial" w:cs="Arial"/>
+                <w:sz w:val="20"/>
+                <w:szCs w:val="20"/>
+              </w:rPr>
+              <w:t xml:space="preserve">Browser redirects to </w:t>
+            </w:r>
+            <w:proofErr w:type="spellStart"/>
+            <w:r>
+              <w:rPr>
+                <w:rFonts w:ascii="Arial" w:eastAsia="Arial" w:hAnsi="Arial" w:cs="Arial"/>
+                <w:sz w:val="20"/>
+                <w:szCs w:val="20"/>
+              </w:rPr>
+              <w:t>login.jsp</w:t>
+            </w:r>
+            <w:proofErr w:type="spellEnd"/>
+          </w:p>
+        </w:tc>
+        <w:tc>
+          <w:tcPr>
+            <w:tcW w:w="2148" w:type="dxa"/>
+          </w:tcPr>
+          <w:p>
+            <w:pPr>
+              <w:spacing w:before="80" w:after="80"/>
+              <w:rPr>
+                <w:rFonts w:ascii="Arial" w:eastAsia="Arial" w:hAnsi="Arial" w:cs="Arial"/>
+                <w:sz w:val="20"/>
+                <w:szCs w:val="20"/>
+              </w:rPr>
+            </w:pPr>
+            <w:r>
+              <w:rPr>
+                <w:rFonts w:ascii="Arial" w:eastAsia="Arial" w:hAnsi="Arial" w:cs="Arial"/>
+                <w:sz w:val="20"/>
+                <w:szCs w:val="20"/>
+              </w:rPr>
+              <w:t>yes</w:t>
+            </w:r>
+          </w:p>
+        </w:tc>
+        <w:tc>
+          <w:tcPr>
+            <w:tcW w:w="2052" w:type="dxa"/>
+          </w:tcPr>
+          <w:p>
+            <w:pPr>
+              <w:spacing w:before="80" w:after="80"/>
+              <w:rPr>
+                <w:rFonts w:ascii="Arial" w:eastAsia="Arial" w:hAnsi="Arial" w:cs="Arial"/>
+                <w:sz w:val="20"/>
+                <w:szCs w:val="20"/>
+              </w:rPr>
+            </w:pPr>
+            <w:r>
+              <w:rPr>
+                <w:rFonts w:ascii="Arial" w:eastAsia="Arial" w:hAnsi="Arial" w:cs="Arial"/>
+                <w:sz w:val="20"/>
+                <w:szCs w:val="20"/>
+              </w:rPr>
+              <w:t>yes</w:t>
+            </w:r>
+          </w:p>
+          <w:p>
+            <w:pPr>
+              <w:spacing w:before="80" w:after="80"/>
+              <w:rPr>
+                <w:rFonts w:ascii="Arial" w:eastAsia="Arial" w:hAnsi="Arial" w:cs="Arial"/>
+                <w:sz w:val="20"/>
+                <w:szCs w:val="20"/>
+              </w:rPr>
+            </w:pPr>
+            <w:r>
+              <w:rPr>
+                <w:rFonts w:ascii="Arial" w:eastAsia="Arial" w:hAnsi="Arial" w:cs="Arial"/>
+                <w:noProof/>
+                <w:sz w:val="20"/>
+                <w:szCs w:val="20"/>
+              </w:rPr>
+              <w:drawing>
+                <wp:inline distT="0" distB="0" distL="0" distR="0" wp14:anchorId="2EE20F39" wp14:editId="552FC64E">
+                  <wp:extent cx="1165860" cy="633730"/>
+                  <wp:effectExtent l="0" t="0" r="0" b="0"/>
+                  <wp:docPr id="1100249282" name="Picture 3"/>
+                  <wp:cNvGraphicFramePr>
+                    <a:graphicFrameLocks xmlns:a="http://schemas.openxmlformats.org/drawingml/2006/main" noChangeAspect="1"/>
+                  </wp:cNvGraphicFramePr>
+                  <a:graphic xmlns:a="http://schemas.openxmlformats.org/drawingml/2006/main">
+                    <a:graphicData uri="http://schemas.openxmlformats.org/drawingml/2006/picture">
+                      <pic:pic xmlns:pic="http://schemas.openxmlformats.org/drawingml/2006/picture">
+                        <pic:nvPicPr>
+                          <pic:cNvPr id="1100249282" name="Picture 1100249282"/>
+                          <pic:cNvPicPr/>
+                        </pic:nvPicPr>
+                        <pic:blipFill>
+                          <a:blip r:embed="rId9" cstate="print">
+                            <a:extLst>
+                              <a:ext uri="{28A0092B-C50C-407E-A947-70E740481C1C}">
+                                <a14:useLocalDpi xmlns:a14="http://schemas.microsoft.com/office/drawing/2010/main" val="0"/>
+                              </a:ext>
+                            </a:extLst>
+                          </a:blip>
+                          <a:stretch>
+                            <a:fillRect/>
+                          </a:stretch>
+                        </pic:blipFill>
+                        <pic:spPr>
+                          <a:xfrm>
+                            <a:off x="0" y="0"/>
+                            <a:ext cx="1165860" cy="633730"/>
+                          </a:xfrm>
+                          <a:prstGeom prst="rect">
+                            <a:avLst/>
+                          </a:prstGeom>
+                        </pic:spPr>
+                      </pic:pic>
+                    </a:graphicData>
+                  </a:graphic>
+                </wp:inline>
+              </w:drawing>
+            </w:r>
+          </w:p>
+        </w:tc>
+      </w:tr>
+      <w:tr>
+        <w:trPr>
+          <w:trHeight w:val="350"/>
+        </w:trPr>
+        <w:tc>
+          <w:tcPr>
+            <w:tcW w:w="1250" w:type="dxa"/>
+          </w:tcPr>
+          <w:p>
+            <w:pPr>
+              <w:spacing w:before="80" w:after="80"/>
+              <w:rPr>
+                <w:rFonts w:ascii="Arial" w:eastAsia="Arial" w:hAnsi="Arial" w:cs="Arial"/>
+                <w:sz w:val="20"/>
+                <w:szCs w:val="20"/>
+              </w:rPr>
+            </w:pPr>
+            <w:r>
+              <w:rPr>
+                <w:rFonts w:ascii="Arial" w:eastAsia="Arial" w:hAnsi="Arial" w:cs="Arial"/>
+                <w:sz w:val="20"/>
+                <w:szCs w:val="20"/>
+              </w:rPr>
               <w:t>3</w:t>
             </w:r>
           </w:p>
@@ -6504,7 +6504,7 @@
                           <pic:cNvPicPr/>
                         </pic:nvPicPr>
                         <pic:blipFill>
-                          <a:blip r:embed="rId9" cstate="print">
+                          <a:blip r:embed="rId10" cstate="print">
                             <a:extLst>
                               <a:ext uri="{28A0092B-C50C-407E-A947-70E740481C1C}">
                                 <a14:useLocalDpi xmlns:a14="http://schemas.microsoft.com/office/drawing/2010/main" val="0"/>
@@ -6922,7 +6922,7 @@
                 <w:bCs/>
               </w:rPr>
             </w:pPr>
-            <w:bookmarkStart w:id="4" w:name="_Toc242638368"/>
+            <w:bookmarkStart w:id="4" w:name="_Toc242649741"/>
             <w:r>
               <w:rPr>
                 <w:rFonts w:ascii="Arial" w:eastAsia="Arial" w:hAnsi="Arial" w:cs="Arial"/>
@@ -7074,6 +7074,16 @@
               </w:rPr>
               <w:t xml:space="preserve">Peer tester: </w:t>
             </w:r>
+            <w:r>
+              <w:rPr>
+                <w:rFonts w:ascii="Arial" w:eastAsia="Arial" w:hAnsi="Arial" w:cs="Arial"/>
+                <w:b/>
+                <w:bCs/>
+                <w:sz w:val="20"/>
+                <w:szCs w:val="20"/>
+              </w:rPr>
+              <w:t>Daniel Preller</w:t>
+            </w:r>
           </w:p>
           <w:p>
             <w:pPr>
@@ -7108,27 +7118,7 @@
                 <w:sz w:val="20"/>
                 <w:szCs w:val="20"/>
               </w:rPr>
-              <w:t>&lt;</w:t>
-            </w:r>
-            <w:proofErr w:type="spellStart"/>
-            <w:r>
-              <w:rPr>
-                <w:rFonts w:ascii="Arial" w:eastAsia="Arial" w:hAnsi="Arial" w:cs="Arial"/>
-                <w:color w:val="C00000"/>
-                <w:sz w:val="20"/>
-                <w:szCs w:val="20"/>
-              </w:rPr>
-              <w:t>yyyy</w:t>
-            </w:r>
-            <w:proofErr w:type="spellEnd"/>
-            <w:r>
-              <w:rPr>
-                <w:rFonts w:ascii="Arial" w:eastAsia="Arial" w:hAnsi="Arial" w:cs="Arial"/>
-                <w:color w:val="C00000"/>
-                <w:sz w:val="20"/>
-                <w:szCs w:val="20"/>
-              </w:rPr>
-              <w:t>/mm/dd&gt;</w:t>
+              <w:t>2026/10/11</w:t>
             </w:r>
           </w:p>
         </w:tc>
@@ -7423,7 +7413,7 @@
                 <w:sz w:val="20"/>
                 <w:szCs w:val="20"/>
               </w:rPr>
-              <w:t>&lt;yes/no&gt;</w:t>
+              <w:t>yes</w:t>
             </w:r>
           </w:p>
         </w:tc>
@@ -7568,7 +7558,68 @@
                 <w:sz w:val="20"/>
                 <w:szCs w:val="20"/>
               </w:rPr>
-              <w:t>&lt;yes/no&gt;</w:t>
+              <w:t>yes</w:t>
+            </w:r>
+          </w:p>
+          <w:p>
+            <w:pPr>
+              <w:spacing w:before="80" w:after="80"/>
+              <w:rPr>
+                <w:rFonts w:ascii="Arial" w:eastAsia="Arial" w:hAnsi="Arial" w:cs="Arial"/>
+                <w:color w:val="C00000"/>
+                <w:sz w:val="20"/>
+                <w:szCs w:val="20"/>
+              </w:rPr>
+            </w:pPr>
+            <w:r>
+              <w:rPr>
+                <w:rFonts w:ascii="Arial" w:eastAsia="Arial" w:hAnsi="Arial" w:cs="Arial"/>
+                <w:noProof/>
+                <w:color w:val="C00000"/>
+                <w:sz w:val="20"/>
+                <w:szCs w:val="20"/>
+              </w:rPr>
+              <w:drawing>
+                <wp:inline distT="0" distB="0" distL="0" distR="0" wp14:anchorId="1974F9FD" wp14:editId="2D99736A">
+                  <wp:extent cx="1165860" cy="367665"/>
+                  <wp:effectExtent l="0" t="0" r="0" b="0"/>
+                  <wp:docPr id="1674185164" name="Picture 1"/>
+                  <wp:cNvGraphicFramePr>
+                    <a:graphicFrameLocks xmlns:a="http://schemas.openxmlformats.org/drawingml/2006/main" noChangeAspect="1"/>
+                  </wp:cNvGraphicFramePr>
+                  <a:graphic xmlns:a="http://schemas.openxmlformats.org/drawingml/2006/main">
+                    <a:graphicData uri="http://schemas.openxmlformats.org/drawingml/2006/picture">
+                      <pic:pic xmlns:pic="http://schemas.openxmlformats.org/drawingml/2006/picture">
+                        <pic:nvPicPr>
+                          <pic:cNvPr id="1674185164" name="Picture 1674185164"/>
+                          <pic:cNvPicPr/>
+                        </pic:nvPicPr>
+                        <pic:blipFill>
+                          <a:blip r:embed="rId11" cstate="print">
+                            <a:extLst>
+                              <a:ext uri="{28A0092B-C50C-407E-A947-70E740481C1C}">
+                                <a14:useLocalDpi xmlns:a14="http://schemas.microsoft.com/office/drawing/2010/main" val="0"/>
+                              </a:ext>
+                            </a:extLst>
+                          </a:blip>
+                          <a:stretch>
+                            <a:fillRect/>
+                          </a:stretch>
+                        </pic:blipFill>
+                        <pic:spPr>
+                          <a:xfrm>
+                            <a:off x="0" y="0"/>
+                            <a:ext cx="1165860" cy="367665"/>
+                          </a:xfrm>
+                          <a:prstGeom prst="rect">
+                            <a:avLst/>
+                          </a:prstGeom>
+                        </pic:spPr>
+                      </pic:pic>
+                    </a:graphicData>
+                  </a:graphic>
+                </wp:inline>
+              </w:drawing>
             </w:r>
           </w:p>
         </w:tc>
@@ -7733,7 +7784,7 @@
                 <w:sz w:val="20"/>
                 <w:szCs w:val="20"/>
               </w:rPr>
-              <w:t>&lt;yes/no&gt;</w:t>
+              <w:t>yes</w:t>
             </w:r>
           </w:p>
         </w:tc>
@@ -7891,7 +7942,7 @@
                           <pic:cNvPicPr/>
                         </pic:nvPicPr>
                         <pic:blipFill>
-                          <a:blip r:embed="rId10" cstate="print">
+                          <a:blip r:embed="rId12" cstate="print">
                             <a:extLst>
                               <a:ext uri="{28A0092B-C50C-407E-A947-70E740481C1C}">
                                 <a14:useLocalDpi xmlns:a14="http://schemas.microsoft.com/office/drawing/2010/main" val="0"/>
@@ -7940,7 +7991,68 @@
                 <w:sz w:val="20"/>
                 <w:szCs w:val="20"/>
               </w:rPr>
-              <w:t>&lt;yes/no&gt;</w:t>
+              <w:t>yes</w:t>
+            </w:r>
+          </w:p>
+          <w:p>
+            <w:pPr>
+              <w:spacing w:before="80" w:after="80"/>
+              <w:rPr>
+                <w:rFonts w:ascii="Arial" w:eastAsia="Arial" w:hAnsi="Arial" w:cs="Arial"/>
+                <w:color w:val="C00000"/>
+                <w:sz w:val="20"/>
+                <w:szCs w:val="20"/>
+              </w:rPr>
+            </w:pPr>
+            <w:r>
+              <w:rPr>
+                <w:rFonts w:ascii="Arial" w:eastAsia="Arial" w:hAnsi="Arial" w:cs="Arial"/>
+                <w:noProof/>
+                <w:color w:val="C00000"/>
+                <w:sz w:val="20"/>
+                <w:szCs w:val="20"/>
+              </w:rPr>
+              <w:drawing>
+                <wp:inline distT="0" distB="0" distL="0" distR="0" wp14:anchorId="5E4B5191" wp14:editId="26AF493D">
+                  <wp:extent cx="1165860" cy="634365"/>
+                  <wp:effectExtent l="0" t="0" r="0" b="0"/>
+                  <wp:docPr id="1760976833" name="Picture 2"/>
+                  <wp:cNvGraphicFramePr>
+                    <a:graphicFrameLocks xmlns:a="http://schemas.openxmlformats.org/drawingml/2006/main" noChangeAspect="1"/>
+                  </wp:cNvGraphicFramePr>
+                  <a:graphic xmlns:a="http://schemas.openxmlformats.org/drawingml/2006/main">
+                    <a:graphicData uri="http://schemas.openxmlformats.org/drawingml/2006/picture">
+                      <pic:pic xmlns:pic="http://schemas.openxmlformats.org/drawingml/2006/picture">
+                        <pic:nvPicPr>
+                          <pic:cNvPr id="1760976833" name="Picture 1760976833"/>
+                          <pic:cNvPicPr/>
+                        </pic:nvPicPr>
+                        <pic:blipFill>
+                          <a:blip r:embed="rId13" cstate="print">
+                            <a:extLst>
+                              <a:ext uri="{28A0092B-C50C-407E-A947-70E740481C1C}">
+                                <a14:useLocalDpi xmlns:a14="http://schemas.microsoft.com/office/drawing/2010/main" val="0"/>
+                              </a:ext>
+                            </a:extLst>
+                          </a:blip>
+                          <a:stretch>
+                            <a:fillRect/>
+                          </a:stretch>
+                        </pic:blipFill>
+                        <pic:spPr>
+                          <a:xfrm>
+                            <a:off x="0" y="0"/>
+                            <a:ext cx="1165860" cy="634365"/>
+                          </a:xfrm>
+                          <a:prstGeom prst="rect">
+                            <a:avLst/>
+                          </a:prstGeom>
+                        </pic:spPr>
+                      </pic:pic>
+                    </a:graphicData>
+                  </a:graphic>
+                </wp:inline>
+              </w:drawing>
             </w:r>
           </w:p>
         </w:tc>
@@ -8076,7 +8188,7 @@
                 <w:sz w:val="20"/>
                 <w:szCs w:val="20"/>
               </w:rPr>
-              <w:t>&lt;yes/no&gt;</w:t>
+              <w:t>yes</w:t>
             </w:r>
           </w:p>
         </w:tc>
@@ -8134,7 +8246,7 @@
                 <w:sz w:val="20"/>
                 <w:szCs w:val="20"/>
               </w:rPr>
-              <w:t>Comments should be substantive; this means there should be at least 2-3 well-structured sentences with constructive feedback.</w:t>
+              <w:t>Login experience is smooth. The form provides the needed functionality but could benefit from additional styling, such as a background image.</w:t>
             </w:r>
           </w:p>
         </w:tc>
@@ -8230,7 +8342,7 @@
                 <w:bCs/>
               </w:rPr>
             </w:pPr>
-            <w:bookmarkStart w:id="5" w:name="_Toc242638369"/>
+            <w:bookmarkStart w:id="5" w:name="_Toc242649742"/>
             <w:r>
               <w:rPr>
                 <w:rFonts w:ascii="Arial" w:eastAsia="Arial" w:hAnsi="Arial" w:cs="Arial"/>
@@ -8381,6 +8493,16 @@
               </w:rPr>
               <w:t xml:space="preserve">Peer tester: </w:t>
             </w:r>
+            <w:r>
+              <w:rPr>
+                <w:rFonts w:ascii="Arial" w:eastAsia="Arial" w:hAnsi="Arial" w:cs="Arial"/>
+                <w:b/>
+                <w:bCs/>
+                <w:sz w:val="20"/>
+                <w:szCs w:val="20"/>
+              </w:rPr>
+              <w:t>Daniel Preller</w:t>
+            </w:r>
           </w:p>
           <w:p>
             <w:pPr>
@@ -8415,27 +8537,7 @@
                 <w:sz w:val="20"/>
                 <w:szCs w:val="20"/>
               </w:rPr>
-              <w:t>&lt;</w:t>
-            </w:r>
-            <w:proofErr w:type="spellStart"/>
-            <w:r>
-              <w:rPr>
-                <w:rFonts w:ascii="Arial" w:eastAsia="Arial" w:hAnsi="Arial" w:cs="Arial"/>
-                <w:color w:val="C00000"/>
-                <w:sz w:val="20"/>
-                <w:szCs w:val="20"/>
-              </w:rPr>
-              <w:t>yyyy</w:t>
-            </w:r>
-            <w:proofErr w:type="spellEnd"/>
-            <w:r>
-              <w:rPr>
-                <w:rFonts w:ascii="Arial" w:eastAsia="Arial" w:hAnsi="Arial" w:cs="Arial"/>
-                <w:color w:val="C00000"/>
-                <w:sz w:val="20"/>
-                <w:szCs w:val="20"/>
-              </w:rPr>
-              <w:t>/mm/dd&gt;</w:t>
+              <w:t>2026/10/11</w:t>
             </w:r>
           </w:p>
         </w:tc>
@@ -8719,7 +8821,68 @@
                 <w:sz w:val="20"/>
                 <w:szCs w:val="20"/>
               </w:rPr>
-              <w:t>&lt;yes/no&gt;</w:t>
+              <w:t>yes</w:t>
+            </w:r>
+          </w:p>
+          <w:p>
+            <w:pPr>
+              <w:spacing w:before="80" w:after="80"/>
+              <w:rPr>
+                <w:rFonts w:ascii="Arial" w:eastAsia="Arial" w:hAnsi="Arial" w:cs="Arial"/>
+                <w:color w:val="C00000"/>
+                <w:sz w:val="20"/>
+                <w:szCs w:val="20"/>
+              </w:rPr>
+            </w:pPr>
+            <w:r>
+              <w:rPr>
+                <w:rFonts w:ascii="Arial" w:eastAsia="Arial" w:hAnsi="Arial" w:cs="Arial"/>
+                <w:noProof/>
+                <w:color w:val="C00000"/>
+                <w:sz w:val="20"/>
+                <w:szCs w:val="20"/>
+              </w:rPr>
+              <w:drawing>
+                <wp:inline distT="0" distB="0" distL="0" distR="0" wp14:anchorId="444F01FC" wp14:editId="6DB7EC99">
+                  <wp:extent cx="1165860" cy="633730"/>
+                  <wp:effectExtent l="0" t="0" r="4445" b="1905"/>
+                  <wp:docPr id="1221255063" name="Picture 3"/>
+                  <wp:cNvGraphicFramePr>
+                    <a:graphicFrameLocks xmlns:a="http://schemas.openxmlformats.org/drawingml/2006/main" noChangeAspect="1"/>
+                  </wp:cNvGraphicFramePr>
+                  <a:graphic xmlns:a="http://schemas.openxmlformats.org/drawingml/2006/main">
+                    <a:graphicData uri="http://schemas.openxmlformats.org/drawingml/2006/picture">
+                      <pic:pic xmlns:pic="http://schemas.openxmlformats.org/drawingml/2006/picture">
+                        <pic:nvPicPr>
+                          <pic:cNvPr id="1221255063" name="Picture 1221255063"/>
+                          <pic:cNvPicPr/>
+                        </pic:nvPicPr>
+                        <pic:blipFill>
+                          <a:blip r:embed="rId8" cstate="print">
+                            <a:extLst>
+                              <a:ext uri="{28A0092B-C50C-407E-A947-70E740481C1C}">
+                                <a14:useLocalDpi xmlns:a14="http://schemas.microsoft.com/office/drawing/2010/main" val="0"/>
+                              </a:ext>
+                            </a:extLst>
+                          </a:blip>
+                          <a:stretch>
+                            <a:fillRect/>
+                          </a:stretch>
+                        </pic:blipFill>
+                        <pic:spPr>
+                          <a:xfrm>
+                            <a:off x="0" y="0"/>
+                            <a:ext cx="1165860" cy="633730"/>
+                          </a:xfrm>
+                          <a:prstGeom prst="rect">
+                            <a:avLst/>
+                          </a:prstGeom>
+                        </pic:spPr>
+                      </pic:pic>
+                    </a:graphicData>
+                  </a:graphic>
+                </wp:inline>
+              </w:drawing>
             </w:r>
           </w:p>
         </w:tc>
@@ -8863,7 +9026,68 @@
                 <w:sz w:val="20"/>
                 <w:szCs w:val="20"/>
               </w:rPr>
-              <w:t>&lt;yes/no&gt;</w:t>
+              <w:t>yes</w:t>
+            </w:r>
+          </w:p>
+          <w:p>
+            <w:pPr>
+              <w:spacing w:before="80" w:after="80"/>
+              <w:rPr>
+                <w:rFonts w:ascii="Arial" w:eastAsia="Arial" w:hAnsi="Arial" w:cs="Arial"/>
+                <w:color w:val="C00000"/>
+                <w:sz w:val="20"/>
+                <w:szCs w:val="20"/>
+              </w:rPr>
+            </w:pPr>
+            <w:r>
+              <w:rPr>
+                <w:rFonts w:ascii="Arial" w:eastAsia="Arial" w:hAnsi="Arial" w:cs="Arial"/>
+                <w:noProof/>
+                <w:color w:val="C00000"/>
+                <w:sz w:val="20"/>
+                <w:szCs w:val="20"/>
+              </w:rPr>
+              <w:drawing>
+                <wp:inline distT="0" distB="0" distL="0" distR="0" wp14:anchorId="7494FB3F" wp14:editId="76A687E2">
+                  <wp:extent cx="1165860" cy="367665"/>
+                  <wp:effectExtent l="0" t="0" r="0" b="0"/>
+                  <wp:docPr id="360613396" name="Picture 4"/>
+                  <wp:cNvGraphicFramePr>
+                    <a:graphicFrameLocks xmlns:a="http://schemas.openxmlformats.org/drawingml/2006/main" noChangeAspect="1"/>
+                  </wp:cNvGraphicFramePr>
+                  <a:graphic xmlns:a="http://schemas.openxmlformats.org/drawingml/2006/main">
+                    <a:graphicData uri="http://schemas.openxmlformats.org/drawingml/2006/picture">
+                      <pic:pic xmlns:pic="http://schemas.openxmlformats.org/drawingml/2006/picture">
+                        <pic:nvPicPr>
+                          <pic:cNvPr id="360613396" name="Picture 360613396"/>
+                          <pic:cNvPicPr/>
+                        </pic:nvPicPr>
+                        <pic:blipFill>
+                          <a:blip r:embed="rId11" cstate="print">
+                            <a:extLst>
+                              <a:ext uri="{28A0092B-C50C-407E-A947-70E740481C1C}">
+                                <a14:useLocalDpi xmlns:a14="http://schemas.microsoft.com/office/drawing/2010/main" val="0"/>
+                              </a:ext>
+                            </a:extLst>
+                          </a:blip>
+                          <a:stretch>
+                            <a:fillRect/>
+                          </a:stretch>
+                        </pic:blipFill>
+                        <pic:spPr>
+                          <a:xfrm>
+                            <a:off x="0" y="0"/>
+                            <a:ext cx="1165860" cy="367665"/>
+                          </a:xfrm>
+                          <a:prstGeom prst="rect">
+                            <a:avLst/>
+                          </a:prstGeom>
+                        </pic:spPr>
+                      </pic:pic>
+                    </a:graphicData>
+                  </a:graphic>
+                </wp:inline>
+              </w:drawing>
             </w:r>
           </w:p>
         </w:tc>
@@ -8989,7 +9213,69 @@
                 <w:sz w:val="20"/>
                 <w:szCs w:val="20"/>
               </w:rPr>
-              <w:t>&lt;yes/no&gt;</w:t>
+              <w:t>yes</w:t>
+            </w:r>
+          </w:p>
+          <w:p>
+            <w:pPr>
+              <w:spacing w:before="80" w:after="80"/>
+              <w:rPr>
+                <w:rFonts w:ascii="Arial" w:eastAsia="Arial" w:hAnsi="Arial" w:cs="Arial"/>
+                <w:color w:val="C00000"/>
+                <w:sz w:val="20"/>
+                <w:szCs w:val="20"/>
+              </w:rPr>
+            </w:pPr>
+            <w:r>
+              <w:rPr>
+                <w:rFonts w:ascii="Arial" w:eastAsia="Arial" w:hAnsi="Arial" w:cs="Arial"/>
+                <w:noProof/>
+                <w:color w:val="C00000"/>
+                <w:sz w:val="20"/>
+                <w:szCs w:val="20"/>
+              </w:rPr>
+              <w:lastRenderedPageBreak/>
+              <w:drawing>
+                <wp:inline distT="0" distB="0" distL="0" distR="0" wp14:anchorId="2C51EFE2" wp14:editId="6F9D0A71">
+                  <wp:extent cx="1165860" cy="625475"/>
+                  <wp:effectExtent l="0" t="0" r="0" b="3175"/>
+                  <wp:docPr id="630354955" name="Picture 5"/>
+                  <wp:cNvGraphicFramePr>
+                    <a:graphicFrameLocks xmlns:a="http://schemas.openxmlformats.org/drawingml/2006/main" noChangeAspect="1"/>
+                  </wp:cNvGraphicFramePr>
+                  <a:graphic xmlns:a="http://schemas.openxmlformats.org/drawingml/2006/main">
+                    <a:graphicData uri="http://schemas.openxmlformats.org/drawingml/2006/picture">
+                      <pic:pic xmlns:pic="http://schemas.openxmlformats.org/drawingml/2006/picture">
+                        <pic:nvPicPr>
+                          <pic:cNvPr id="630354955" name="Picture 630354955"/>
+                          <pic:cNvPicPr/>
+                        </pic:nvPicPr>
+                        <pic:blipFill>
+                          <a:blip r:embed="rId14" cstate="print">
+                            <a:extLst>
+                              <a:ext uri="{28A0092B-C50C-407E-A947-70E740481C1C}">
+                                <a14:useLocalDpi xmlns:a14="http://schemas.microsoft.com/office/drawing/2010/main" val="0"/>
+                              </a:ext>
+                            </a:extLst>
+                          </a:blip>
+                          <a:stretch>
+                            <a:fillRect/>
+                          </a:stretch>
+                        </pic:blipFill>
+                        <pic:spPr>
+                          <a:xfrm>
+                            <a:off x="0" y="0"/>
+                            <a:ext cx="1165860" cy="625475"/>
+                          </a:xfrm>
+                          <a:prstGeom prst="rect">
+                            <a:avLst/>
+                          </a:prstGeom>
+                        </pic:spPr>
+                      </pic:pic>
+                    </a:graphicData>
+                  </a:graphic>
+                </wp:inline>
+              </w:drawing>
             </w:r>
           </w:p>
         </w:tc>
@@ -9017,6 +9303,7 @@
                 <w:sz w:val="20"/>
                 <w:szCs w:val="20"/>
               </w:rPr>
+              <w:lastRenderedPageBreak/>
               <w:t>4</w:t>
             </w:r>
           </w:p>
@@ -9153,7 +9440,7 @@
                 <w:sz w:val="20"/>
                 <w:szCs w:val="20"/>
               </w:rPr>
-              <w:t>&lt;yes/no&gt;</w:t>
+              <w:t>yes</w:t>
             </w:r>
           </w:p>
         </w:tc>
@@ -9279,7 +9566,68 @@
                 <w:sz w:val="20"/>
                 <w:szCs w:val="20"/>
               </w:rPr>
-              <w:t>&lt;yes/no&gt;</w:t>
+              <w:t>yes</w:t>
+            </w:r>
+          </w:p>
+          <w:p>
+            <w:pPr>
+              <w:spacing w:before="80" w:after="80"/>
+              <w:rPr>
+                <w:rFonts w:ascii="Arial" w:eastAsia="Arial" w:hAnsi="Arial" w:cs="Arial"/>
+                <w:color w:val="C00000"/>
+                <w:sz w:val="20"/>
+                <w:szCs w:val="20"/>
+              </w:rPr>
+            </w:pPr>
+            <w:r>
+              <w:rPr>
+                <w:rFonts w:ascii="Arial" w:eastAsia="Arial" w:hAnsi="Arial" w:cs="Arial"/>
+                <w:noProof/>
+                <w:color w:val="C00000"/>
+                <w:sz w:val="20"/>
+                <w:szCs w:val="20"/>
+              </w:rPr>
+              <w:drawing>
+                <wp:inline distT="0" distB="0" distL="0" distR="0" wp14:anchorId="3E9A35E4" wp14:editId="6AC80AD9">
+                  <wp:extent cx="1165860" cy="630555"/>
+                  <wp:effectExtent l="0" t="0" r="0" b="0"/>
+                  <wp:docPr id="1104945637" name="Picture 6"/>
+                  <wp:cNvGraphicFramePr>
+                    <a:graphicFrameLocks xmlns:a="http://schemas.openxmlformats.org/drawingml/2006/main" noChangeAspect="1"/>
+                  </wp:cNvGraphicFramePr>
+                  <a:graphic xmlns:a="http://schemas.openxmlformats.org/drawingml/2006/main">
+                    <a:graphicData uri="http://schemas.openxmlformats.org/drawingml/2006/picture">
+                      <pic:pic xmlns:pic="http://schemas.openxmlformats.org/drawingml/2006/picture">
+                        <pic:nvPicPr>
+                          <pic:cNvPr id="1104945637" name="Picture 1104945637"/>
+                          <pic:cNvPicPr/>
+                        </pic:nvPicPr>
+                        <pic:blipFill>
+                          <a:blip r:embed="rId15" cstate="print">
+                            <a:extLst>
+                              <a:ext uri="{28A0092B-C50C-407E-A947-70E740481C1C}">
+                                <a14:useLocalDpi xmlns:a14="http://schemas.microsoft.com/office/drawing/2010/main" val="0"/>
+                              </a:ext>
+                            </a:extLst>
+                          </a:blip>
+                          <a:stretch>
+                            <a:fillRect/>
+                          </a:stretch>
+                        </pic:blipFill>
+                        <pic:spPr>
+                          <a:xfrm>
+                            <a:off x="0" y="0"/>
+                            <a:ext cx="1165860" cy="630555"/>
+                          </a:xfrm>
+                          <a:prstGeom prst="rect">
+                            <a:avLst/>
+                          </a:prstGeom>
+                        </pic:spPr>
+                      </pic:pic>
+                    </a:graphicData>
+                  </a:graphic>
+                </wp:inline>
+              </w:drawing>
             </w:r>
           </w:p>
         </w:tc>
@@ -9307,7 +9655,6 @@
                 <w:sz w:val="20"/>
                 <w:szCs w:val="20"/>
               </w:rPr>
-              <w:lastRenderedPageBreak/>
               <w:t>6</w:t>
             </w:r>
           </w:p>
@@ -9381,7 +9728,7 @@
                 <w:sz w:val="20"/>
                 <w:szCs w:val="20"/>
               </w:rPr>
-              <w:t>&lt;yes/no&gt;</w:t>
+              <w:t>&lt;yes&gt;</w:t>
             </w:r>
             <w:r>
               <w:rPr>
@@ -9407,7 +9754,7 @@
                           <pic:cNvPicPr/>
                         </pic:nvPicPr>
                         <pic:blipFill>
-                          <a:blip r:embed="rId11" cstate="print">
+                          <a:blip r:embed="rId16" cstate="print">
                             <a:extLst>
                               <a:ext uri="{28A0092B-C50C-407E-A947-70E740481C1C}">
                                 <a14:useLocalDpi xmlns:a14="http://schemas.microsoft.com/office/drawing/2010/main" val="0"/>
@@ -9456,8 +9803,19 @@
                 <w:sz w:val="20"/>
                 <w:szCs w:val="20"/>
               </w:rPr>
-              <w:t>&lt;yes/no&gt;</w:t>
-            </w:r>
+              <w:t>yes</w:t>
+            </w:r>
+          </w:p>
+          <w:p>
+            <w:pPr>
+              <w:spacing w:before="80" w:after="80"/>
+              <w:rPr>
+                <w:rFonts w:ascii="Arial" w:eastAsia="Arial" w:hAnsi="Arial" w:cs="Arial"/>
+                <w:color w:val="C00000"/>
+                <w:sz w:val="20"/>
+                <w:szCs w:val="20"/>
+              </w:rPr>
+            </w:pPr>
           </w:p>
         </w:tc>
       </w:tr>
@@ -9557,7 +9915,7 @@
                 <w:sz w:val="20"/>
                 <w:szCs w:val="20"/>
               </w:rPr>
-              <w:t>&lt;yes/no&gt;</w:t>
+              <w:t>&lt;yes&gt;</w:t>
             </w:r>
           </w:p>
         </w:tc>
@@ -9582,7 +9940,7 @@
                 <w:sz w:val="20"/>
                 <w:szCs w:val="20"/>
               </w:rPr>
-              <w:t>&lt;yes/no&gt;</w:t>
+              <w:t>yes</w:t>
             </w:r>
           </w:p>
         </w:tc>
@@ -9640,7 +9998,7 @@
                 <w:sz w:val="20"/>
                 <w:szCs w:val="20"/>
               </w:rPr>
-              <w:t>Comments should be substantive; this means there should be at least 2-3 well-structured sentences with constructive feedback.</w:t>
+              <w:t>The login experience is smooth, although there is a small discrepancy between the registration page in terms of where the error message is displayed. Clearing the password when an incorrect login is attempted may also not be necessary because the problem may be the email address instead.</w:t>
             </w:r>
           </w:p>
         </w:tc>
@@ -9665,8 +10023,8 @@
       </w:pPr>
     </w:p>
     <w:sectPr>
-      <w:headerReference w:type="default" r:id="rId12"/>
-      <w:footerReference w:type="default" r:id="rId13"/>
+      <w:headerReference w:type="default" r:id="rId17"/>
+      <w:footerReference w:type="default" r:id="rId18"/>
       <w:pgSz w:w="15840" w:h="12240" w:orient="landscape"/>
       <w:pgMar w:top="1440" w:right="1440" w:bottom="1440" w:left="1440" w:header="720" w:footer="720" w:gutter="0"/>
       <w:pgNumType w:start="1"/>
@@ -11038,6 +11396,10 @@
 </go:gDocsCustomXmlDataStorage>
 </file>
 
+<file path=customXml/item2.xml><?xml version="1.0" encoding="utf-8"?>
+<b:Sources xmlns:b="http://schemas.openxmlformats.org/officeDocument/2006/bibliography" xmlns="http://schemas.openxmlformats.org/officeDocument/2006/bibliography" SelectedStyle="\APASixthEditionOfficeOnline.xsl" StyleName="APA" Version="6"/>
+</file>
+
 <file path=customXml/itemProps1.xml><?xml version="1.0" encoding="utf-8"?>
 <ds:datastoreItem xmlns:ds="http://schemas.openxmlformats.org/officeDocument/2006/customXml" ds:itemID="{11111111-1234-1234-1234-123412341234}">
   <ds:schemaRefs>
@@ -11045,4 +11407,12 @@
     <ds:schemaRef ds:uri="http://schemas.openxmlformats.org/officeDocument/2006/relationships"/>
   </ds:schemaRefs>
 </ds:datastoreItem>
+</file>
+
+<file path=customXml/itemProps2.xml><?xml version="1.0" encoding="utf-8"?>
+<ds:datastoreItem xmlns:ds="http://schemas.openxmlformats.org/officeDocument/2006/customXml" ds:itemID="{0617C393-E845-4882-B237-F46D5FB616C6}">
+  <ds:schemaRefs>
+    <ds:schemaRef ds:uri="http://schemas.openxmlformats.org/officeDocument/2006/bibliography"/>
+  </ds:schemaRefs>
+</ds:datastoreItem>
 </file>
</xml_diff>

<commit_message>
Added final test cases results. Added deliverable .zip file in module-5 folder
</commit_message>
<xml_diff>
--- a/module-5/TestPlanTemplate.docx
+++ b/module-5/TestPlanTemplate.docx
@@ -486,7 +486,7 @@
                 <w:noProof/>
                 <w:webHidden/>
               </w:rPr>
-              <w:t>2</w:t>
+              <w:t>3</w:t>
             </w:r>
             <w:r>
               <w:rPr>
@@ -563,7 +563,7 @@
                 <w:noProof/>
                 <w:webHidden/>
               </w:rPr>
-              <w:t>2</w:t>
+              <w:t>4</w:t>
             </w:r>
             <w:r>
               <w:rPr>
@@ -640,7 +640,7 @@
                 <w:noProof/>
                 <w:webHidden/>
               </w:rPr>
-              <w:t>3</w:t>
+              <w:t>5</w:t>
             </w:r>
             <w:r>
               <w:rPr>
@@ -717,7 +717,7 @@
                 <w:noProof/>
                 <w:webHidden/>
               </w:rPr>
-              <w:t>4</w:t>
+              <w:t>6</w:t>
             </w:r>
             <w:r>
               <w:rPr>
@@ -794,7 +794,7 @@
                 <w:noProof/>
                 <w:webHidden/>
               </w:rPr>
-              <w:t>6</w:t>
+              <w:t>8</w:t>
             </w:r>
             <w:r>
               <w:rPr>
@@ -871,7 +871,7 @@
                 <w:noProof/>
                 <w:webHidden/>
               </w:rPr>
-              <w:t>7</w:t>
+              <w:t>9</w:t>
             </w:r>
             <w:r>
               <w:rPr>
@@ -1345,6 +1345,7 @@
                 <w:sz w:val="24"/>
                 <w:szCs w:val="24"/>
               </w:rPr>
+              <w:lastRenderedPageBreak/>
               <w:t>Test 1</w:t>
             </w:r>
           </w:p>
@@ -1514,6 +1515,16 @@
               </w:rPr>
               <w:t xml:space="preserve">Peer tester: </w:t>
             </w:r>
+            <w:r>
+              <w:rPr>
+                <w:rFonts w:ascii="Arial" w:eastAsia="Arial" w:hAnsi="Arial" w:cs="Arial"/>
+                <w:b/>
+                <w:bCs/>
+                <w:sz w:val="20"/>
+                <w:szCs w:val="20"/>
+              </w:rPr>
+              <w:t>Daniel Preller</w:t>
+            </w:r>
           </w:p>
           <w:p>
             <w:pPr>
@@ -1548,27 +1559,7 @@
                 <w:sz w:val="20"/>
                 <w:szCs w:val="20"/>
               </w:rPr>
-              <w:t>&lt;</w:t>
-            </w:r>
-            <w:proofErr w:type="spellStart"/>
-            <w:r>
-              <w:rPr>
-                <w:rFonts w:ascii="Arial" w:eastAsia="Arial" w:hAnsi="Arial" w:cs="Arial"/>
-                <w:color w:val="C00000"/>
-                <w:sz w:val="20"/>
-                <w:szCs w:val="20"/>
-              </w:rPr>
-              <w:t>yyyy</w:t>
-            </w:r>
-            <w:proofErr w:type="spellEnd"/>
-            <w:r>
-              <w:rPr>
-                <w:rFonts w:ascii="Arial" w:eastAsia="Arial" w:hAnsi="Arial" w:cs="Arial"/>
-                <w:color w:val="C00000"/>
-                <w:sz w:val="20"/>
-                <w:szCs w:val="20"/>
-              </w:rPr>
-              <w:t>/mm/dd&gt;</w:t>
+              <w:t>2026/10/11</w:t>
             </w:r>
           </w:p>
         </w:tc>
@@ -1870,7 +1861,68 @@
                 <w:sz w:val="20"/>
                 <w:szCs w:val="20"/>
               </w:rPr>
-              <w:t>&lt;yes/no&gt;</w:t>
+              <w:t>yes</w:t>
+            </w:r>
+          </w:p>
+          <w:p>
+            <w:pPr>
+              <w:spacing w:before="80" w:after="80"/>
+              <w:rPr>
+                <w:rFonts w:ascii="Arial" w:eastAsia="Arial" w:hAnsi="Arial" w:cs="Arial"/>
+                <w:color w:val="C00000"/>
+                <w:sz w:val="20"/>
+                <w:szCs w:val="20"/>
+              </w:rPr>
+            </w:pPr>
+            <w:r>
+              <w:rPr>
+                <w:rFonts w:ascii="Arial" w:eastAsia="Arial" w:hAnsi="Arial" w:cs="Arial"/>
+                <w:noProof/>
+                <w:color w:val="C00000"/>
+                <w:sz w:val="20"/>
+                <w:szCs w:val="20"/>
+              </w:rPr>
+              <w:drawing>
+                <wp:inline distT="0" distB="0" distL="0" distR="0" wp14:anchorId="2E9A1676" wp14:editId="6104F505">
+                  <wp:extent cx="1165860" cy="630555"/>
+                  <wp:effectExtent l="0" t="0" r="0" b="0"/>
+                  <wp:docPr id="1695999973" name="Picture 7"/>
+                  <wp:cNvGraphicFramePr>
+                    <a:graphicFrameLocks xmlns:a="http://schemas.openxmlformats.org/drawingml/2006/main" noChangeAspect="1"/>
+                  </wp:cNvGraphicFramePr>
+                  <a:graphic xmlns:a="http://schemas.openxmlformats.org/drawingml/2006/main">
+                    <a:graphicData uri="http://schemas.openxmlformats.org/drawingml/2006/picture">
+                      <pic:pic xmlns:pic="http://schemas.openxmlformats.org/drawingml/2006/picture">
+                        <pic:nvPicPr>
+                          <pic:cNvPr id="1695999973" name="Picture 1695999973"/>
+                          <pic:cNvPicPr/>
+                        </pic:nvPicPr>
+                        <pic:blipFill>
+                          <a:blip r:embed="rId8" cstate="print">
+                            <a:extLst>
+                              <a:ext uri="{28A0092B-C50C-407E-A947-70E740481C1C}">
+                                <a14:useLocalDpi xmlns:a14="http://schemas.microsoft.com/office/drawing/2010/main" val="0"/>
+                              </a:ext>
+                            </a:extLst>
+                          </a:blip>
+                          <a:stretch>
+                            <a:fillRect/>
+                          </a:stretch>
+                        </pic:blipFill>
+                        <pic:spPr>
+                          <a:xfrm>
+                            <a:off x="0" y="0"/>
+                            <a:ext cx="1165860" cy="630555"/>
+                          </a:xfrm>
+                          <a:prstGeom prst="rect">
+                            <a:avLst/>
+                          </a:prstGeom>
+                        </pic:spPr>
+                      </pic:pic>
+                    </a:graphicData>
+                  </a:graphic>
+                </wp:inline>
+              </w:drawing>
             </w:r>
           </w:p>
         </w:tc>
@@ -1992,7 +2044,68 @@
                 <w:sz w:val="20"/>
                 <w:szCs w:val="20"/>
               </w:rPr>
-              <w:t>&lt;yes/no&gt;</w:t>
+              <w:t>Yes</w:t>
+            </w:r>
+          </w:p>
+          <w:p>
+            <w:pPr>
+              <w:spacing w:before="80" w:after="80"/>
+              <w:rPr>
+                <w:rFonts w:ascii="Arial" w:eastAsia="Arial" w:hAnsi="Arial" w:cs="Arial"/>
+                <w:color w:val="C00000"/>
+                <w:sz w:val="20"/>
+                <w:szCs w:val="20"/>
+              </w:rPr>
+            </w:pPr>
+            <w:r>
+              <w:rPr>
+                <w:rFonts w:ascii="Arial" w:eastAsia="Arial" w:hAnsi="Arial" w:cs="Arial"/>
+                <w:noProof/>
+                <w:color w:val="C00000"/>
+                <w:sz w:val="20"/>
+                <w:szCs w:val="20"/>
+              </w:rPr>
+              <w:drawing>
+                <wp:inline distT="0" distB="0" distL="0" distR="0" wp14:anchorId="3F8EECE9" wp14:editId="11FAE3E1">
+                  <wp:extent cx="1165860" cy="627380"/>
+                  <wp:effectExtent l="0" t="0" r="0" b="1270"/>
+                  <wp:docPr id="1884805847" name="Picture 8"/>
+                  <wp:cNvGraphicFramePr>
+                    <a:graphicFrameLocks xmlns:a="http://schemas.openxmlformats.org/drawingml/2006/main" noChangeAspect="1"/>
+                  </wp:cNvGraphicFramePr>
+                  <a:graphic xmlns:a="http://schemas.openxmlformats.org/drawingml/2006/main">
+                    <a:graphicData uri="http://schemas.openxmlformats.org/drawingml/2006/picture">
+                      <pic:pic xmlns:pic="http://schemas.openxmlformats.org/drawingml/2006/picture">
+                        <pic:nvPicPr>
+                          <pic:cNvPr id="1884805847" name="Picture 1884805847"/>
+                          <pic:cNvPicPr/>
+                        </pic:nvPicPr>
+                        <pic:blipFill>
+                          <a:blip r:embed="rId9" cstate="print">
+                            <a:extLst>
+                              <a:ext uri="{28A0092B-C50C-407E-A947-70E740481C1C}">
+                                <a14:useLocalDpi xmlns:a14="http://schemas.microsoft.com/office/drawing/2010/main" val="0"/>
+                              </a:ext>
+                            </a:extLst>
+                          </a:blip>
+                          <a:stretch>
+                            <a:fillRect/>
+                          </a:stretch>
+                        </pic:blipFill>
+                        <pic:spPr>
+                          <a:xfrm>
+                            <a:off x="0" y="0"/>
+                            <a:ext cx="1165860" cy="627380"/>
+                          </a:xfrm>
+                          <a:prstGeom prst="rect">
+                            <a:avLst/>
+                          </a:prstGeom>
+                        </pic:spPr>
+                      </pic:pic>
+                    </a:graphicData>
+                  </a:graphic>
+                </wp:inline>
+              </w:drawing>
             </w:r>
           </w:p>
         </w:tc>
@@ -2232,7 +2345,7 @@
                 <w:sz w:val="20"/>
                 <w:szCs w:val="20"/>
               </w:rPr>
-              <w:t>&lt;yes/no&gt;</w:t>
+              <w:t>yes</w:t>
             </w:r>
           </w:p>
         </w:tc>
@@ -2354,7 +2467,69 @@
                 <w:sz w:val="20"/>
                 <w:szCs w:val="20"/>
               </w:rPr>
-              <w:t>&lt;yes/no&gt;</w:t>
+              <w:t>yes</w:t>
+            </w:r>
+          </w:p>
+          <w:p>
+            <w:pPr>
+              <w:spacing w:before="80" w:after="80"/>
+              <w:rPr>
+                <w:rFonts w:ascii="Arial" w:eastAsia="Arial" w:hAnsi="Arial" w:cs="Arial"/>
+                <w:color w:val="C00000"/>
+                <w:sz w:val="20"/>
+                <w:szCs w:val="20"/>
+              </w:rPr>
+            </w:pPr>
+            <w:r>
+              <w:rPr>
+                <w:rFonts w:ascii="Arial" w:eastAsia="Arial" w:hAnsi="Arial" w:cs="Arial"/>
+                <w:noProof/>
+                <w:color w:val="C00000"/>
+                <w:sz w:val="20"/>
+                <w:szCs w:val="20"/>
+              </w:rPr>
+              <w:lastRenderedPageBreak/>
+              <w:drawing>
+                <wp:inline distT="0" distB="0" distL="0" distR="0" wp14:anchorId="2FA6CFAB" wp14:editId="005D2FAE">
+                  <wp:extent cx="1165860" cy="632460"/>
+                  <wp:effectExtent l="0" t="0" r="0" b="0"/>
+                  <wp:docPr id="684110755" name="Picture 9"/>
+                  <wp:cNvGraphicFramePr>
+                    <a:graphicFrameLocks xmlns:a="http://schemas.openxmlformats.org/drawingml/2006/main" noChangeAspect="1"/>
+                  </wp:cNvGraphicFramePr>
+                  <a:graphic xmlns:a="http://schemas.openxmlformats.org/drawingml/2006/main">
+                    <a:graphicData uri="http://schemas.openxmlformats.org/drawingml/2006/picture">
+                      <pic:pic xmlns:pic="http://schemas.openxmlformats.org/drawingml/2006/picture">
+                        <pic:nvPicPr>
+                          <pic:cNvPr id="684110755" name="Picture 684110755"/>
+                          <pic:cNvPicPr/>
+                        </pic:nvPicPr>
+                        <pic:blipFill>
+                          <a:blip r:embed="rId10" cstate="print">
+                            <a:extLst>
+                              <a:ext uri="{28A0092B-C50C-407E-A947-70E740481C1C}">
+                                <a14:useLocalDpi xmlns:a14="http://schemas.microsoft.com/office/drawing/2010/main" val="0"/>
+                              </a:ext>
+                            </a:extLst>
+                          </a:blip>
+                          <a:stretch>
+                            <a:fillRect/>
+                          </a:stretch>
+                        </pic:blipFill>
+                        <pic:spPr>
+                          <a:xfrm>
+                            <a:off x="0" y="0"/>
+                            <a:ext cx="1165860" cy="632460"/>
+                          </a:xfrm>
+                          <a:prstGeom prst="rect">
+                            <a:avLst/>
+                          </a:prstGeom>
+                        </pic:spPr>
+                      </pic:pic>
+                    </a:graphicData>
+                  </a:graphic>
+                </wp:inline>
+              </w:drawing>
             </w:r>
           </w:p>
         </w:tc>
@@ -2386,6 +2561,7 @@
                 <w:sz w:val="20"/>
                 <w:szCs w:val="20"/>
               </w:rPr>
+              <w:lastRenderedPageBreak/>
               <w:t>Comments</w:t>
             </w:r>
           </w:p>
@@ -2412,7 +2588,7 @@
                 <w:sz w:val="20"/>
                 <w:szCs w:val="20"/>
               </w:rPr>
-              <w:t xml:space="preserve">Comments should be substantive; this means there should be at least 2-3 well-structured sentences with constructive feedback. </w:t>
+              <w:t>Registration without errors is smooth and fast. One current issue is that, because of the lengths of their labels, the fields are not aligned vertically.</w:t>
             </w:r>
           </w:p>
         </w:tc>
@@ -2651,6 +2827,16 @@
               </w:rPr>
               <w:t xml:space="preserve">Peer tester: </w:t>
             </w:r>
+            <w:r>
+              <w:rPr>
+                <w:rFonts w:ascii="Arial" w:eastAsia="Arial" w:hAnsi="Arial" w:cs="Arial"/>
+                <w:b/>
+                <w:bCs/>
+                <w:sz w:val="20"/>
+                <w:szCs w:val="20"/>
+              </w:rPr>
+              <w:t>Daniel Preller</w:t>
+            </w:r>
           </w:p>
           <w:p>
             <w:pPr>
@@ -2685,27 +2871,7 @@
                 <w:sz w:val="20"/>
                 <w:szCs w:val="20"/>
               </w:rPr>
-              <w:t>&lt;</w:t>
-            </w:r>
-            <w:proofErr w:type="spellStart"/>
-            <w:r>
-              <w:rPr>
-                <w:rFonts w:ascii="Arial" w:eastAsia="Arial" w:hAnsi="Arial" w:cs="Arial"/>
-                <w:color w:val="C00000"/>
-                <w:sz w:val="20"/>
-                <w:szCs w:val="20"/>
-              </w:rPr>
-              <w:t>yyyy</w:t>
-            </w:r>
-            <w:proofErr w:type="spellEnd"/>
-            <w:r>
-              <w:rPr>
-                <w:rFonts w:ascii="Arial" w:eastAsia="Arial" w:hAnsi="Arial" w:cs="Arial"/>
-                <w:color w:val="C00000"/>
-                <w:sz w:val="20"/>
-                <w:szCs w:val="20"/>
-              </w:rPr>
-              <w:t>/mm/dd&gt;</w:t>
+              <w:t>2026/10/11</w:t>
             </w:r>
           </w:p>
         </w:tc>
@@ -2985,7 +3151,68 @@
                 <w:sz w:val="20"/>
                 <w:szCs w:val="20"/>
               </w:rPr>
-              <w:t>&lt;yes/no&gt;</w:t>
+              <w:t>yes</w:t>
+            </w:r>
+          </w:p>
+          <w:p>
+            <w:pPr>
+              <w:spacing w:before="80" w:after="80"/>
+              <w:rPr>
+                <w:rFonts w:ascii="Arial" w:eastAsia="Arial" w:hAnsi="Arial" w:cs="Arial"/>
+                <w:color w:val="C00000"/>
+                <w:sz w:val="20"/>
+                <w:szCs w:val="20"/>
+              </w:rPr>
+            </w:pPr>
+            <w:r>
+              <w:rPr>
+                <w:rFonts w:ascii="Arial" w:eastAsia="Arial" w:hAnsi="Arial" w:cs="Arial"/>
+                <w:noProof/>
+                <w:color w:val="C00000"/>
+                <w:sz w:val="20"/>
+                <w:szCs w:val="20"/>
+              </w:rPr>
+              <w:drawing>
+                <wp:inline distT="0" distB="0" distL="0" distR="0" wp14:anchorId="25D4FFAF" wp14:editId="3D649F8F">
+                  <wp:extent cx="1165860" cy="630555"/>
+                  <wp:effectExtent l="0" t="0" r="0" b="0"/>
+                  <wp:docPr id="404765946" name="Picture 1"/>
+                  <wp:cNvGraphicFramePr>
+                    <a:graphicFrameLocks xmlns:a="http://schemas.openxmlformats.org/drawingml/2006/main" noChangeAspect="1"/>
+                  </wp:cNvGraphicFramePr>
+                  <a:graphic xmlns:a="http://schemas.openxmlformats.org/drawingml/2006/main">
+                    <a:graphicData uri="http://schemas.openxmlformats.org/drawingml/2006/picture">
+                      <pic:pic xmlns:pic="http://schemas.openxmlformats.org/drawingml/2006/picture">
+                        <pic:nvPicPr>
+                          <pic:cNvPr id="404765946" name="Picture 404765946"/>
+                          <pic:cNvPicPr/>
+                        </pic:nvPicPr>
+                        <pic:blipFill>
+                          <a:blip r:embed="rId8" cstate="print">
+                            <a:extLst>
+                              <a:ext uri="{28A0092B-C50C-407E-A947-70E740481C1C}">
+                                <a14:useLocalDpi xmlns:a14="http://schemas.microsoft.com/office/drawing/2010/main" val="0"/>
+                              </a:ext>
+                            </a:extLst>
+                          </a:blip>
+                          <a:stretch>
+                            <a:fillRect/>
+                          </a:stretch>
+                        </pic:blipFill>
+                        <pic:spPr>
+                          <a:xfrm>
+                            <a:off x="0" y="0"/>
+                            <a:ext cx="1165860" cy="630555"/>
+                          </a:xfrm>
+                          <a:prstGeom prst="rect">
+                            <a:avLst/>
+                          </a:prstGeom>
+                        </pic:spPr>
+                      </pic:pic>
+                    </a:graphicData>
+                  </a:graphic>
+                </wp:inline>
+              </w:drawing>
             </w:r>
           </w:p>
         </w:tc>
@@ -3107,7 +3334,68 @@
                 <w:sz w:val="20"/>
                 <w:szCs w:val="20"/>
               </w:rPr>
-              <w:t>&lt;yes/no&gt;</w:t>
+              <w:t>yes</w:t>
+            </w:r>
+          </w:p>
+          <w:p>
+            <w:pPr>
+              <w:spacing w:before="80" w:after="80"/>
+              <w:rPr>
+                <w:rFonts w:ascii="Arial" w:eastAsia="Arial" w:hAnsi="Arial" w:cs="Arial"/>
+                <w:color w:val="C00000"/>
+                <w:sz w:val="20"/>
+                <w:szCs w:val="20"/>
+              </w:rPr>
+            </w:pPr>
+            <w:r>
+              <w:rPr>
+                <w:rFonts w:ascii="Arial" w:eastAsia="Arial" w:hAnsi="Arial" w:cs="Arial"/>
+                <w:noProof/>
+                <w:color w:val="C00000"/>
+                <w:sz w:val="20"/>
+                <w:szCs w:val="20"/>
+              </w:rPr>
+              <w:drawing>
+                <wp:inline distT="0" distB="0" distL="0" distR="0" wp14:anchorId="0FC732BD" wp14:editId="388E1266">
+                  <wp:extent cx="1165860" cy="627380"/>
+                  <wp:effectExtent l="0" t="0" r="0" b="1270"/>
+                  <wp:docPr id="434178944" name="Picture 2"/>
+                  <wp:cNvGraphicFramePr>
+                    <a:graphicFrameLocks xmlns:a="http://schemas.openxmlformats.org/drawingml/2006/main" noChangeAspect="1"/>
+                  </wp:cNvGraphicFramePr>
+                  <a:graphic xmlns:a="http://schemas.openxmlformats.org/drawingml/2006/main">
+                    <a:graphicData uri="http://schemas.openxmlformats.org/drawingml/2006/picture">
+                      <pic:pic xmlns:pic="http://schemas.openxmlformats.org/drawingml/2006/picture">
+                        <pic:nvPicPr>
+                          <pic:cNvPr id="434178944" name="Picture 434178944"/>
+                          <pic:cNvPicPr/>
+                        </pic:nvPicPr>
+                        <pic:blipFill>
+                          <a:blip r:embed="rId9" cstate="print">
+                            <a:extLst>
+                              <a:ext uri="{28A0092B-C50C-407E-A947-70E740481C1C}">
+                                <a14:useLocalDpi xmlns:a14="http://schemas.microsoft.com/office/drawing/2010/main" val="0"/>
+                              </a:ext>
+                            </a:extLst>
+                          </a:blip>
+                          <a:stretch>
+                            <a:fillRect/>
+                          </a:stretch>
+                        </pic:blipFill>
+                        <pic:spPr>
+                          <a:xfrm>
+                            <a:off x="0" y="0"/>
+                            <a:ext cx="1165860" cy="627380"/>
+                          </a:xfrm>
+                          <a:prstGeom prst="rect">
+                            <a:avLst/>
+                          </a:prstGeom>
+                        </pic:spPr>
+                      </pic:pic>
+                    </a:graphicData>
+                  </a:graphic>
+                </wp:inline>
+              </w:drawing>
             </w:r>
           </w:p>
         </w:tc>
@@ -3229,7 +3517,68 @@
                 <w:sz w:val="20"/>
                 <w:szCs w:val="20"/>
               </w:rPr>
-              <w:t>&lt;yes/no&gt;</w:t>
+              <w:t>yes</w:t>
+            </w:r>
+          </w:p>
+          <w:p>
+            <w:pPr>
+              <w:spacing w:before="80" w:after="80"/>
+              <w:rPr>
+                <w:rFonts w:ascii="Arial" w:eastAsia="Arial" w:hAnsi="Arial" w:cs="Arial"/>
+                <w:color w:val="C00000"/>
+                <w:sz w:val="20"/>
+                <w:szCs w:val="20"/>
+              </w:rPr>
+            </w:pPr>
+            <w:r>
+              <w:rPr>
+                <w:rFonts w:ascii="Arial" w:eastAsia="Arial" w:hAnsi="Arial" w:cs="Arial"/>
+                <w:noProof/>
+                <w:color w:val="C00000"/>
+                <w:sz w:val="20"/>
+                <w:szCs w:val="20"/>
+              </w:rPr>
+              <w:drawing>
+                <wp:inline distT="0" distB="0" distL="0" distR="0" wp14:anchorId="5595181E" wp14:editId="62DFA371">
+                  <wp:extent cx="1165860" cy="630555"/>
+                  <wp:effectExtent l="0" t="0" r="0" b="0"/>
+                  <wp:docPr id="1405644844" name="Picture 3"/>
+                  <wp:cNvGraphicFramePr>
+                    <a:graphicFrameLocks xmlns:a="http://schemas.openxmlformats.org/drawingml/2006/main" noChangeAspect="1"/>
+                  </wp:cNvGraphicFramePr>
+                  <a:graphic xmlns:a="http://schemas.openxmlformats.org/drawingml/2006/main">
+                    <a:graphicData uri="http://schemas.openxmlformats.org/drawingml/2006/picture">
+                      <pic:pic xmlns:pic="http://schemas.openxmlformats.org/drawingml/2006/picture">
+                        <pic:nvPicPr>
+                          <pic:cNvPr id="1405644844" name="Picture 1405644844"/>
+                          <pic:cNvPicPr/>
+                        </pic:nvPicPr>
+                        <pic:blipFill>
+                          <a:blip r:embed="rId11" cstate="print">
+                            <a:extLst>
+                              <a:ext uri="{28A0092B-C50C-407E-A947-70E740481C1C}">
+                                <a14:useLocalDpi xmlns:a14="http://schemas.microsoft.com/office/drawing/2010/main" val="0"/>
+                              </a:ext>
+                            </a:extLst>
+                          </a:blip>
+                          <a:stretch>
+                            <a:fillRect/>
+                          </a:stretch>
+                        </pic:blipFill>
+                        <pic:spPr>
+                          <a:xfrm>
+                            <a:off x="0" y="0"/>
+                            <a:ext cx="1165860" cy="630555"/>
+                          </a:xfrm>
+                          <a:prstGeom prst="rect">
+                            <a:avLst/>
+                          </a:prstGeom>
+                        </pic:spPr>
+                      </pic:pic>
+                    </a:graphicData>
+                  </a:graphic>
+                </wp:inline>
+              </w:drawing>
             </w:r>
           </w:p>
         </w:tc>
@@ -3334,6 +3683,7 @@
                 <w:sz w:val="20"/>
                 <w:szCs w:val="20"/>
               </w:rPr>
+              <w:lastRenderedPageBreak/>
               <w:t>Email: Susanasus@mail.com</w:t>
             </w:r>
           </w:p>
@@ -3421,6 +3771,7 @@
                 <w:sz w:val="20"/>
                 <w:szCs w:val="20"/>
               </w:rPr>
+              <w:lastRenderedPageBreak/>
               <w:t>Information appears in form; password is blocked out</w:t>
             </w:r>
           </w:p>
@@ -3469,7 +3820,7 @@
                 <w:sz w:val="20"/>
                 <w:szCs w:val="20"/>
               </w:rPr>
-              <w:t>&lt;yes/no&gt;</w:t>
+              <w:t>yes</w:t>
             </w:r>
           </w:p>
         </w:tc>
@@ -3591,7 +3942,68 @@
                 <w:sz w:val="20"/>
                 <w:szCs w:val="20"/>
               </w:rPr>
-              <w:t>&lt;yes/no&gt;</w:t>
+              <w:t>yes</w:t>
+            </w:r>
+          </w:p>
+          <w:p>
+            <w:pPr>
+              <w:spacing w:before="80" w:after="80"/>
+              <w:rPr>
+                <w:rFonts w:ascii="Arial" w:eastAsia="Arial" w:hAnsi="Arial" w:cs="Arial"/>
+                <w:color w:val="C00000"/>
+                <w:sz w:val="20"/>
+                <w:szCs w:val="20"/>
+              </w:rPr>
+            </w:pPr>
+            <w:r>
+              <w:rPr>
+                <w:rFonts w:ascii="Arial" w:eastAsia="Arial" w:hAnsi="Arial" w:cs="Arial"/>
+                <w:noProof/>
+                <w:color w:val="C00000"/>
+                <w:sz w:val="20"/>
+                <w:szCs w:val="20"/>
+              </w:rPr>
+              <w:drawing>
+                <wp:inline distT="0" distB="0" distL="0" distR="0" wp14:anchorId="753D6999" wp14:editId="3971EEB7">
+                  <wp:extent cx="1165860" cy="630555"/>
+                  <wp:effectExtent l="0" t="0" r="0" b="0"/>
+                  <wp:docPr id="2128503250" name="Picture 4"/>
+                  <wp:cNvGraphicFramePr>
+                    <a:graphicFrameLocks xmlns:a="http://schemas.openxmlformats.org/drawingml/2006/main" noChangeAspect="1"/>
+                  </wp:cNvGraphicFramePr>
+                  <a:graphic xmlns:a="http://schemas.openxmlformats.org/drawingml/2006/main">
+                    <a:graphicData uri="http://schemas.openxmlformats.org/drawingml/2006/picture">
+                      <pic:pic xmlns:pic="http://schemas.openxmlformats.org/drawingml/2006/picture">
+                        <pic:nvPicPr>
+                          <pic:cNvPr id="2128503250" name="Picture 2128503250"/>
+                          <pic:cNvPicPr/>
+                        </pic:nvPicPr>
+                        <pic:blipFill>
+                          <a:blip r:embed="rId12" cstate="print">
+                            <a:extLst>
+                              <a:ext uri="{28A0092B-C50C-407E-A947-70E740481C1C}">
+                                <a14:useLocalDpi xmlns:a14="http://schemas.microsoft.com/office/drawing/2010/main" val="0"/>
+                              </a:ext>
+                            </a:extLst>
+                          </a:blip>
+                          <a:stretch>
+                            <a:fillRect/>
+                          </a:stretch>
+                        </pic:blipFill>
+                        <pic:spPr>
+                          <a:xfrm>
+                            <a:off x="0" y="0"/>
+                            <a:ext cx="1165860" cy="630555"/>
+                          </a:xfrm>
+                          <a:prstGeom prst="rect">
+                            <a:avLst/>
+                          </a:prstGeom>
+                        </pic:spPr>
+                      </pic:pic>
+                    </a:graphicData>
+                  </a:graphic>
+                </wp:inline>
+              </w:drawing>
             </w:r>
           </w:p>
         </w:tc>
@@ -3706,6 +4118,15 @@
                 <w:szCs w:val="20"/>
               </w:rPr>
             </w:pPr>
+            <w:r>
+              <w:rPr>
+                <w:rFonts w:ascii="Arial" w:eastAsia="Arial" w:hAnsi="Arial" w:cs="Arial"/>
+                <w:color w:val="C00000"/>
+                <w:sz w:val="20"/>
+                <w:szCs w:val="20"/>
+              </w:rPr>
+              <w:t>yes</w:t>
+            </w:r>
           </w:p>
         </w:tc>
       </w:tr>
@@ -3819,6 +4240,76 @@
                 <w:szCs w:val="20"/>
               </w:rPr>
             </w:pPr>
+            <w:r>
+              <w:rPr>
+                <w:rFonts w:ascii="Arial" w:eastAsia="Arial" w:hAnsi="Arial" w:cs="Arial"/>
+                <w:color w:val="C00000"/>
+                <w:sz w:val="20"/>
+                <w:szCs w:val="20"/>
+              </w:rPr>
+              <w:t>yes</w:t>
+            </w:r>
+          </w:p>
+          <w:p>
+            <w:pPr>
+              <w:spacing w:before="80" w:after="80"/>
+              <w:rPr>
+                <w:rFonts w:ascii="Arial" w:eastAsia="Arial" w:hAnsi="Arial" w:cs="Arial"/>
+                <w:color w:val="C00000"/>
+                <w:sz w:val="20"/>
+                <w:szCs w:val="20"/>
+              </w:rPr>
+            </w:pPr>
+            <w:r>
+              <w:rPr>
+                <w:rFonts w:ascii="Arial" w:eastAsia="Arial" w:hAnsi="Arial" w:cs="Arial"/>
+                <w:noProof/>
+                <w:color w:val="C00000"/>
+                <w:sz w:val="20"/>
+                <w:szCs w:val="20"/>
+              </w:rPr>
+              <w:drawing>
+                <wp:inline distT="0" distB="0" distL="0" distR="0" wp14:anchorId="62B9D60C" wp14:editId="31197A34">
+                  <wp:extent cx="1165860" cy="631825"/>
+                  <wp:effectExtent l="0" t="0" r="0" b="0"/>
+                  <wp:docPr id="1068222959" name="Picture 5"/>
+                  <wp:cNvGraphicFramePr>
+                    <a:graphicFrameLocks xmlns:a="http://schemas.openxmlformats.org/drawingml/2006/main" noChangeAspect="1"/>
+                  </wp:cNvGraphicFramePr>
+                  <a:graphic xmlns:a="http://schemas.openxmlformats.org/drawingml/2006/main">
+                    <a:graphicData uri="http://schemas.openxmlformats.org/drawingml/2006/picture">
+                      <pic:pic xmlns:pic="http://schemas.openxmlformats.org/drawingml/2006/picture">
+                        <pic:nvPicPr>
+                          <pic:cNvPr id="1068222959" name="Picture 1068222959"/>
+                          <pic:cNvPicPr/>
+                        </pic:nvPicPr>
+                        <pic:blipFill>
+                          <a:blip r:embed="rId13" cstate="print">
+                            <a:extLst>
+                              <a:ext uri="{28A0092B-C50C-407E-A947-70E740481C1C}">
+                                <a14:useLocalDpi xmlns:a14="http://schemas.microsoft.com/office/drawing/2010/main" val="0"/>
+                              </a:ext>
+                            </a:extLst>
+                          </a:blip>
+                          <a:stretch>
+                            <a:fillRect/>
+                          </a:stretch>
+                        </pic:blipFill>
+                        <pic:spPr>
+                          <a:xfrm>
+                            <a:off x="0" y="0"/>
+                            <a:ext cx="1165860" cy="631825"/>
+                          </a:xfrm>
+                          <a:prstGeom prst="rect">
+                            <a:avLst/>
+                          </a:prstGeom>
+                        </pic:spPr>
+                      </pic:pic>
+                    </a:graphicData>
+                  </a:graphic>
+                </wp:inline>
+              </w:drawing>
+            </w:r>
           </w:p>
         </w:tc>
       </w:tr>
@@ -3875,7 +4366,7 @@
                 <w:sz w:val="20"/>
                 <w:szCs w:val="20"/>
               </w:rPr>
-              <w:t>Comments should be substantive; this means there should be at least 2-3 well-structured sentences with constructive feedback.</w:t>
+              <w:t>Registration process is smooth and prevents users from entering invalid information. The error messages could benefit from something that makes them stand out more, such as colored text. There is also a discrepancy between the placement of the error messages on the login and registration pages.</w:t>
             </w:r>
           </w:p>
         </w:tc>
@@ -4190,7 +4681,6 @@
                 <w:sz w:val="20"/>
                 <w:szCs w:val="20"/>
               </w:rPr>
-              <w:lastRenderedPageBreak/>
               <w:t>Step</w:t>
             </w:r>
           </w:p>
@@ -4732,6 +5222,7 @@
                 <w:sz w:val="20"/>
                 <w:szCs w:val="20"/>
               </w:rPr>
+              <w:lastRenderedPageBreak/>
               <w:drawing>
                 <wp:inline distT="0" distB="0" distL="0" distR="0" wp14:anchorId="011878CF" wp14:editId="1CE40ED3">
                   <wp:extent cx="1165860" cy="633730"/>
@@ -4748,7 +5239,7 @@
                           <pic:cNvPicPr/>
                         </pic:nvPicPr>
                         <pic:blipFill>
-                          <a:blip r:embed="rId8" cstate="print">
+                          <a:blip r:embed="rId14" cstate="print">
                             <a:extLst>
                               <a:ext uri="{28A0092B-C50C-407E-A947-70E740481C1C}">
                                 <a14:useLocalDpi xmlns:a14="http://schemas.microsoft.com/office/drawing/2010/main" val="0"/>
@@ -4800,6 +5291,7 @@
                 <w:sz w:val="20"/>
                 <w:szCs w:val="20"/>
               </w:rPr>
+              <w:lastRenderedPageBreak/>
               <w:t>4</w:t>
             </w:r>
           </w:p>
@@ -5252,7 +5744,7 @@
                 <w:sz w:val="20"/>
                 <w:szCs w:val="20"/>
               </w:rPr>
-              <w:t>no (captions are not present)</w:t>
+              <w:t>yes</w:t>
             </w:r>
           </w:p>
         </w:tc>
@@ -5428,7 +5920,7 @@
                 <w:sz w:val="20"/>
                 <w:szCs w:val="20"/>
               </w:rPr>
-              <w:t>The current home page is well designed. Captions need to be added. The navigation links could benefit from an indication when they are being hovered over.</w:t>
+              <w:t>The current home page is well designed. The navigation links could benefit from an indication when they are being hovered over.</w:t>
             </w:r>
           </w:p>
         </w:tc>
@@ -5878,7 +6370,6 @@
                 <w:sz w:val="20"/>
                 <w:szCs w:val="20"/>
               </w:rPr>
-              <w:lastRenderedPageBreak/>
               <w:t>1</w:t>
             </w:r>
           </w:p>
@@ -6006,7 +6497,7 @@
                           <pic:cNvPicPr/>
                         </pic:nvPicPr>
                         <pic:blipFill>
-                          <a:blip r:embed="rId8" cstate="print">
+                          <a:blip r:embed="rId14" cstate="print">
                             <a:extLst>
                               <a:ext uri="{28A0092B-C50C-407E-A947-70E740481C1C}">
                                 <a14:useLocalDpi xmlns:a14="http://schemas.microsoft.com/office/drawing/2010/main" val="0"/>
@@ -6179,6 +6670,7 @@
                 <w:sz w:val="20"/>
                 <w:szCs w:val="20"/>
               </w:rPr>
+              <w:lastRenderedPageBreak/>
               <w:drawing>
                 <wp:inline distT="0" distB="0" distL="0" distR="0" wp14:anchorId="2EE20F39" wp14:editId="552FC64E">
                   <wp:extent cx="1165860" cy="633730"/>
@@ -6195,7 +6687,7 @@
                           <pic:cNvPicPr/>
                         </pic:nvPicPr>
                         <pic:blipFill>
-                          <a:blip r:embed="rId9" cstate="print">
+                          <a:blip r:embed="rId15" cstate="print">
                             <a:extLst>
                               <a:ext uri="{28A0092B-C50C-407E-A947-70E740481C1C}">
                                 <a14:useLocalDpi xmlns:a14="http://schemas.microsoft.com/office/drawing/2010/main" val="0"/>
@@ -6247,6 +6739,7 @@
                 <w:sz w:val="20"/>
                 <w:szCs w:val="20"/>
               </w:rPr>
+              <w:lastRenderedPageBreak/>
               <w:t>3</w:t>
             </w:r>
           </w:p>
@@ -6504,7 +6997,7 @@
                           <pic:cNvPicPr/>
                         </pic:nvPicPr>
                         <pic:blipFill>
-                          <a:blip r:embed="rId10" cstate="print">
+                          <a:blip r:embed="rId16" cstate="print">
                             <a:extLst>
                               <a:ext uri="{28A0092B-C50C-407E-A947-70E740481C1C}">
                                 <a14:useLocalDpi xmlns:a14="http://schemas.microsoft.com/office/drawing/2010/main" val="0"/>
@@ -7595,7 +8088,7 @@
                           <pic:cNvPicPr/>
                         </pic:nvPicPr>
                         <pic:blipFill>
-                          <a:blip r:embed="rId11" cstate="print">
+                          <a:blip r:embed="rId17" cstate="print">
                             <a:extLst>
                               <a:ext uri="{28A0092B-C50C-407E-A947-70E740481C1C}">
                                 <a14:useLocalDpi xmlns:a14="http://schemas.microsoft.com/office/drawing/2010/main" val="0"/>
@@ -7942,7 +8435,7 @@
                           <pic:cNvPicPr/>
                         </pic:nvPicPr>
                         <pic:blipFill>
-                          <a:blip r:embed="rId12" cstate="print">
+                          <a:blip r:embed="rId18" cstate="print">
                             <a:extLst>
                               <a:ext uri="{28A0092B-C50C-407E-A947-70E740481C1C}">
                                 <a14:useLocalDpi xmlns:a14="http://schemas.microsoft.com/office/drawing/2010/main" val="0"/>
@@ -8013,7 +8506,7 @@
                 <w:szCs w:val="20"/>
               </w:rPr>
               <w:drawing>
-                <wp:inline distT="0" distB="0" distL="0" distR="0" wp14:anchorId="5E4B5191" wp14:editId="26AF493D">
+                <wp:inline distT="0" distB="0" distL="0" distR="0" wp14:anchorId="5E4B5191" wp14:editId="5F96A3DF">
                   <wp:extent cx="1165860" cy="634365"/>
                   <wp:effectExtent l="0" t="0" r="0" b="0"/>
                   <wp:docPr id="1760976833" name="Picture 2"/>
@@ -8028,7 +8521,7 @@
                           <pic:cNvPicPr/>
                         </pic:nvPicPr>
                         <pic:blipFill>
-                          <a:blip r:embed="rId13" cstate="print">
+                          <a:blip r:embed="rId19" cstate="print">
                             <a:extLst>
                               <a:ext uri="{28A0092B-C50C-407E-A947-70E740481C1C}">
                                 <a14:useLocalDpi xmlns:a14="http://schemas.microsoft.com/office/drawing/2010/main" val="0"/>
@@ -8858,7 +9351,7 @@
                           <pic:cNvPicPr/>
                         </pic:nvPicPr>
                         <pic:blipFill>
-                          <a:blip r:embed="rId8" cstate="print">
+                          <a:blip r:embed="rId14" cstate="print">
                             <a:extLst>
                               <a:ext uri="{28A0092B-C50C-407E-A947-70E740481C1C}">
                                 <a14:useLocalDpi xmlns:a14="http://schemas.microsoft.com/office/drawing/2010/main" val="0"/>
@@ -9063,7 +9556,7 @@
                           <pic:cNvPicPr/>
                         </pic:nvPicPr>
                         <pic:blipFill>
-                          <a:blip r:embed="rId11" cstate="print">
+                          <a:blip r:embed="rId17" cstate="print">
                             <a:extLst>
                               <a:ext uri="{28A0092B-C50C-407E-A947-70E740481C1C}">
                                 <a14:useLocalDpi xmlns:a14="http://schemas.microsoft.com/office/drawing/2010/main" val="0"/>
@@ -9251,7 +9744,7 @@
                           <pic:cNvPicPr/>
                         </pic:nvPicPr>
                         <pic:blipFill>
-                          <a:blip r:embed="rId14" cstate="print">
+                          <a:blip r:embed="rId20" cstate="print">
                             <a:extLst>
                               <a:ext uri="{28A0092B-C50C-407E-A947-70E740481C1C}">
                                 <a14:useLocalDpi xmlns:a14="http://schemas.microsoft.com/office/drawing/2010/main" val="0"/>
@@ -9603,7 +10096,7 @@
                           <pic:cNvPicPr/>
                         </pic:nvPicPr>
                         <pic:blipFill>
-                          <a:blip r:embed="rId15" cstate="print">
+                          <a:blip r:embed="rId21" cstate="print">
                             <a:extLst>
                               <a:ext uri="{28A0092B-C50C-407E-A947-70E740481C1C}">
                                 <a14:useLocalDpi xmlns:a14="http://schemas.microsoft.com/office/drawing/2010/main" val="0"/>
@@ -9754,7 +10247,7 @@
                           <pic:cNvPicPr/>
                         </pic:nvPicPr>
                         <pic:blipFill>
-                          <a:blip r:embed="rId16" cstate="print">
+                          <a:blip r:embed="rId22" cstate="print">
                             <a:extLst>
                               <a:ext uri="{28A0092B-C50C-407E-A947-70E740481C1C}">
                                 <a14:useLocalDpi xmlns:a14="http://schemas.microsoft.com/office/drawing/2010/main" val="0"/>
@@ -10023,8 +10516,8 @@
       </w:pPr>
     </w:p>
     <w:sectPr>
-      <w:headerReference w:type="default" r:id="rId17"/>
-      <w:footerReference w:type="default" r:id="rId18"/>
+      <w:headerReference w:type="default" r:id="rId23"/>
+      <w:footerReference w:type="default" r:id="rId24"/>
       <w:pgSz w:w="15840" w:h="12240" w:orient="landscape"/>
       <w:pgMar w:top="1440" w:right="1440" w:bottom="1440" w:left="1440" w:header="720" w:footer="720" w:gutter="0"/>
       <w:pgNumType w:start="1"/>
@@ -11391,28 +11884,28 @@
 </file>
 
 <file path=customXml/item1.xml><?xml version="1.0" encoding="utf-8"?>
+<b:Sources xmlns:b="http://schemas.openxmlformats.org/officeDocument/2006/bibliography" xmlns="http://schemas.openxmlformats.org/officeDocument/2006/bibliography" SelectedStyle="\APASixthEditionOfficeOnline.xsl" StyleName="APA" Version="6"/>
+</file>
+
+<file path=customXml/item2.xml><?xml version="1.0" encoding="utf-8"?>
 <go:gDocsCustomXmlDataStorage xmlns:go="http://customooxmlschemas.google.com/" xmlns:r="http://schemas.openxmlformats.org/officeDocument/2006/relationships" uri="GoogleDocsCustomDataVersion2">
   <go:docsCustomData xmlns:go="http://customooxmlschemas.google.com/" roundtripDataSignature="AMtx7mhydoCSW61KdT94sGKYs55e3TTjmg==">CgMxLjAyDmgud3U2Ym9ocmplZXZwMg5oLjlmZzA0bzdoaDNiYzIOaC5nYXQ0aXY0MmJjdWcyDmgudGRrdzB4dmQwa2QzOAByITFMZjBxSERBOGhTbXhkQ0I4bUs4bFNOekozTEplZHpINw==</go:docsCustomData>
 </go:gDocsCustomXmlDataStorage>
 </file>
 
-<file path=customXml/item2.xml><?xml version="1.0" encoding="utf-8"?>
-<b:Sources xmlns:b="http://schemas.openxmlformats.org/officeDocument/2006/bibliography" xmlns="http://schemas.openxmlformats.org/officeDocument/2006/bibliography" SelectedStyle="\APASixthEditionOfficeOnline.xsl" StyleName="APA" Version="6"/>
+<file path=customXml/itemProps1.xml><?xml version="1.0" encoding="utf-8"?>
+<ds:datastoreItem xmlns:ds="http://schemas.openxmlformats.org/officeDocument/2006/customXml" ds:itemID="{0617C393-E845-4882-B237-F46D5FB616C6}">
+  <ds:schemaRefs>
+    <ds:schemaRef ds:uri="http://schemas.openxmlformats.org/officeDocument/2006/bibliography"/>
+  </ds:schemaRefs>
+</ds:datastoreItem>
 </file>
 
-<file path=customXml/itemProps1.xml><?xml version="1.0" encoding="utf-8"?>
+<file path=customXml/itemProps2.xml><?xml version="1.0" encoding="utf-8"?>
 <ds:datastoreItem xmlns:ds="http://schemas.openxmlformats.org/officeDocument/2006/customXml" ds:itemID="{11111111-1234-1234-1234-123412341234}">
   <ds:schemaRefs>
     <ds:schemaRef ds:uri="http://customooxmlschemas.google.com/"/>
     <ds:schemaRef ds:uri="http://schemas.openxmlformats.org/officeDocument/2006/relationships"/>
   </ds:schemaRefs>
 </ds:datastoreItem>
-</file>
-
-<file path=customXml/itemProps2.xml><?xml version="1.0" encoding="utf-8"?>
-<ds:datastoreItem xmlns:ds="http://schemas.openxmlformats.org/officeDocument/2006/customXml" ds:itemID="{0617C393-E845-4882-B237-F46D5FB616C6}">
-  <ds:schemaRefs>
-    <ds:schemaRef ds:uri="http://schemas.openxmlformats.org/officeDocument/2006/bibliography"/>
-  </ds:schemaRefs>
-</ds:datastoreItem>
 </file>
</xml_diff>